<commit_message>
Add 23_10_2026 BankingSystem case study
</commit_message>
<xml_diff>
--- a/19_10_2026/j_unit_5.docx
+++ b/19_10_2026/j_unit_5.docx
@@ -23128,6 +23128,7 @@
       </w:pPr>
       <w:r>
         <w:rPr>
+          <w:noProof/>
           <w:sz w:val="28"/>
           <w:szCs w:val="28"/>
           <w:lang w:val="en-US"/>
@@ -25223,6 +25224,2320 @@
     </w:p>
     <w:p>
       <w:pPr>
+        <w:spacing w:before="100" w:beforeAutospacing="1" w:after="100" w:afterAutospacing="1" w:line="240" w:lineRule="auto"/>
+        <w:outlineLvl w:val="1"/>
+        <w:rPr>
+          <w:rFonts w:ascii="Times New Roman" w:eastAsia="Times New Roman" w:hAnsi="Times New Roman" w:cs="Times New Roman"/>
+          <w:b/>
+          <w:bCs/>
+          <w:kern w:val="0"/>
+          <w:sz w:val="36"/>
+          <w:szCs w:val="36"/>
+          <w:lang w:eastAsia="en-IN"/>
+          <w14:ligatures w14:val="none"/>
+        </w:rPr>
+      </w:pPr>
+      <w:r>
+        <w:rPr>
+          <w:rFonts w:ascii="Times New Roman" w:eastAsia="Times New Roman" w:hAnsi="Times New Roman" w:cs="Times New Roman"/>
+          <w:b/>
+          <w:bCs/>
+          <w:kern w:val="0"/>
+          <w:sz w:val="36"/>
+          <w:szCs w:val="36"/>
+          <w:lang w:eastAsia="en-IN"/>
+          <w14:ligatures w14:val="none"/>
+        </w:rPr>
+        <w:t>Types of Testing — Understand the Diagram</w:t>
+      </w:r>
+    </w:p>
+    <w:p>
+      <w:pPr>
+        <w:spacing w:before="100" w:beforeAutospacing="1" w:after="100" w:afterAutospacing="1" w:line="240" w:lineRule="auto"/>
+        <w:rPr>
+          <w:rFonts w:ascii="Times New Roman" w:eastAsia="Times New Roman" w:hAnsi="Times New Roman" w:cs="Times New Roman"/>
+          <w:kern w:val="0"/>
+          <w:sz w:val="24"/>
+          <w:szCs w:val="24"/>
+          <w:lang w:eastAsia="en-IN"/>
+          <w14:ligatures w14:val="none"/>
+        </w:rPr>
+      </w:pPr>
+      <w:r>
+        <w:rPr>
+          <w:rFonts w:ascii="Times New Roman" w:eastAsia="Times New Roman" w:hAnsi="Times New Roman" w:cs="Times New Roman"/>
+          <w:kern w:val="0"/>
+          <w:sz w:val="24"/>
+          <w:szCs w:val="24"/>
+          <w:lang w:eastAsia="en-IN"/>
+          <w14:ligatures w14:val="none"/>
+        </w:rPr>
+        <w:t>The diagram shows testing from small scope to broad scope.</w:t>
+      </w:r>
+    </w:p>
+    <w:p>
+      <w:pPr>
+        <w:tabs>
+          <w:tab w:val="left" w:pos="916"/>
+          <w:tab w:val="left" w:pos="1832"/>
+          <w:tab w:val="left" w:pos="2748"/>
+          <w:tab w:val="left" w:pos="3664"/>
+          <w:tab w:val="left" w:pos="4580"/>
+          <w:tab w:val="left" w:pos="5496"/>
+          <w:tab w:val="left" w:pos="6412"/>
+          <w:tab w:val="left" w:pos="7328"/>
+          <w:tab w:val="left" w:pos="8244"/>
+          <w:tab w:val="left" w:pos="9160"/>
+          <w:tab w:val="left" w:pos="10076"/>
+          <w:tab w:val="left" w:pos="10992"/>
+          <w:tab w:val="left" w:pos="11908"/>
+          <w:tab w:val="left" w:pos="12824"/>
+          <w:tab w:val="left" w:pos="13740"/>
+          <w:tab w:val="left" w:pos="14656"/>
+        </w:tabs>
+        <w:spacing w:after="0" w:line="240" w:lineRule="auto"/>
+        <w:rPr>
+          <w:rFonts w:ascii="Courier New" w:eastAsia="Times New Roman" w:hAnsi="Courier New" w:cs="Courier New"/>
+          <w:kern w:val="0"/>
+          <w:sz w:val="20"/>
+          <w:szCs w:val="20"/>
+          <w:lang w:eastAsia="en-IN"/>
+          <w14:ligatures w14:val="none"/>
+        </w:rPr>
+      </w:pPr>
+      <w:r>
+        <w:rPr>
+          <w:rFonts w:ascii="Courier New" w:eastAsia="Times New Roman" w:hAnsi="Courier New" w:cs="Courier New"/>
+          <w:kern w:val="0"/>
+          <w:sz w:val="20"/>
+          <w:szCs w:val="20"/>
+          <w:lang w:eastAsia="en-IN"/>
+          <w14:ligatures w14:val="none"/>
+        </w:rPr>
+        <w:t xml:space="preserve">      ┌──────────────────────────────┐</w:t>
+      </w:r>
+    </w:p>
+    <w:p>
+      <w:pPr>
+        <w:tabs>
+          <w:tab w:val="left" w:pos="916"/>
+          <w:tab w:val="left" w:pos="1832"/>
+          <w:tab w:val="left" w:pos="2748"/>
+          <w:tab w:val="left" w:pos="3664"/>
+          <w:tab w:val="left" w:pos="4580"/>
+          <w:tab w:val="left" w:pos="5496"/>
+          <w:tab w:val="left" w:pos="6412"/>
+          <w:tab w:val="left" w:pos="7328"/>
+          <w:tab w:val="left" w:pos="8244"/>
+          <w:tab w:val="left" w:pos="9160"/>
+          <w:tab w:val="left" w:pos="10076"/>
+          <w:tab w:val="left" w:pos="10992"/>
+          <w:tab w:val="left" w:pos="11908"/>
+          <w:tab w:val="left" w:pos="12824"/>
+          <w:tab w:val="left" w:pos="13740"/>
+          <w:tab w:val="left" w:pos="14656"/>
+        </w:tabs>
+        <w:spacing w:after="0" w:line="240" w:lineRule="auto"/>
+        <w:rPr>
+          <w:rFonts w:ascii="Courier New" w:eastAsia="Times New Roman" w:hAnsi="Courier New" w:cs="Courier New"/>
+          <w:kern w:val="0"/>
+          <w:sz w:val="20"/>
+          <w:szCs w:val="20"/>
+          <w:lang w:eastAsia="en-IN"/>
+          <w14:ligatures w14:val="none"/>
+        </w:rPr>
+      </w:pPr>
+      <w:r>
+        <w:rPr>
+          <w:rFonts w:ascii="Courier New" w:eastAsia="Times New Roman" w:hAnsi="Courier New" w:cs="Courier New"/>
+          <w:kern w:val="0"/>
+          <w:sz w:val="20"/>
+          <w:szCs w:val="20"/>
+          <w:lang w:eastAsia="en-IN"/>
+          <w14:ligatures w14:val="none"/>
+        </w:rPr>
+        <w:t xml:space="preserve">      │      FUNCTIONAL TESTING      │</w:t>
+      </w:r>
+    </w:p>
+    <w:p>
+      <w:pPr>
+        <w:tabs>
+          <w:tab w:val="left" w:pos="916"/>
+          <w:tab w:val="left" w:pos="1832"/>
+          <w:tab w:val="left" w:pos="2748"/>
+          <w:tab w:val="left" w:pos="3664"/>
+          <w:tab w:val="left" w:pos="4580"/>
+          <w:tab w:val="left" w:pos="5496"/>
+          <w:tab w:val="left" w:pos="6412"/>
+          <w:tab w:val="left" w:pos="7328"/>
+          <w:tab w:val="left" w:pos="8244"/>
+          <w:tab w:val="left" w:pos="9160"/>
+          <w:tab w:val="left" w:pos="10076"/>
+          <w:tab w:val="left" w:pos="10992"/>
+          <w:tab w:val="left" w:pos="11908"/>
+          <w:tab w:val="left" w:pos="12824"/>
+          <w:tab w:val="left" w:pos="13740"/>
+          <w:tab w:val="left" w:pos="14656"/>
+        </w:tabs>
+        <w:spacing w:after="0" w:line="240" w:lineRule="auto"/>
+        <w:rPr>
+          <w:rFonts w:ascii="Courier New" w:eastAsia="Times New Roman" w:hAnsi="Courier New" w:cs="Courier New"/>
+          <w:kern w:val="0"/>
+          <w:sz w:val="20"/>
+          <w:szCs w:val="20"/>
+          <w:lang w:eastAsia="en-IN"/>
+          <w14:ligatures w14:val="none"/>
+        </w:rPr>
+      </w:pPr>
+      <w:r>
+        <w:rPr>
+          <w:rFonts w:ascii="Courier New" w:eastAsia="Times New Roman" w:hAnsi="Courier New" w:cs="Courier New"/>
+          <w:kern w:val="0"/>
+          <w:sz w:val="20"/>
+          <w:szCs w:val="20"/>
+          <w:lang w:eastAsia="en-IN"/>
+          <w14:ligatures w14:val="none"/>
+        </w:rPr>
+        <w:t xml:space="preserve">      │   ┌──────────────────────┐   │</w:t>
+      </w:r>
+    </w:p>
+    <w:p>
+      <w:pPr>
+        <w:tabs>
+          <w:tab w:val="left" w:pos="916"/>
+          <w:tab w:val="left" w:pos="1832"/>
+          <w:tab w:val="left" w:pos="2748"/>
+          <w:tab w:val="left" w:pos="3664"/>
+          <w:tab w:val="left" w:pos="4580"/>
+          <w:tab w:val="left" w:pos="5496"/>
+          <w:tab w:val="left" w:pos="6412"/>
+          <w:tab w:val="left" w:pos="7328"/>
+          <w:tab w:val="left" w:pos="8244"/>
+          <w:tab w:val="left" w:pos="9160"/>
+          <w:tab w:val="left" w:pos="10076"/>
+          <w:tab w:val="left" w:pos="10992"/>
+          <w:tab w:val="left" w:pos="11908"/>
+          <w:tab w:val="left" w:pos="12824"/>
+          <w:tab w:val="left" w:pos="13740"/>
+          <w:tab w:val="left" w:pos="14656"/>
+        </w:tabs>
+        <w:spacing w:after="0" w:line="240" w:lineRule="auto"/>
+        <w:rPr>
+          <w:rFonts w:ascii="Courier New" w:eastAsia="Times New Roman" w:hAnsi="Courier New" w:cs="Courier New"/>
+          <w:kern w:val="0"/>
+          <w:sz w:val="20"/>
+          <w:szCs w:val="20"/>
+          <w:lang w:eastAsia="en-IN"/>
+          <w14:ligatures w14:val="none"/>
+        </w:rPr>
+      </w:pPr>
+      <w:r>
+        <w:rPr>
+          <w:rFonts w:ascii="Courier New" w:eastAsia="Times New Roman" w:hAnsi="Courier New" w:cs="Courier New"/>
+          <w:kern w:val="0"/>
+          <w:sz w:val="20"/>
+          <w:szCs w:val="20"/>
+          <w:lang w:eastAsia="en-IN"/>
+          <w14:ligatures w14:val="none"/>
+        </w:rPr>
+        <w:t xml:space="preserve">      │   </w:t>
+      </w:r>
+      <w:proofErr w:type="gramStart"/>
+      <w:r>
+        <w:rPr>
+          <w:rFonts w:ascii="Courier New" w:eastAsia="Times New Roman" w:hAnsi="Courier New" w:cs="Courier New"/>
+          <w:kern w:val="0"/>
+          <w:sz w:val="20"/>
+          <w:szCs w:val="20"/>
+          <w:lang w:eastAsia="en-IN"/>
+          <w14:ligatures w14:val="none"/>
+        </w:rPr>
+        <w:t>│  INTEGRATION</w:t>
+      </w:r>
+      <w:proofErr w:type="gramEnd"/>
+      <w:r>
+        <w:rPr>
+          <w:rFonts w:ascii="Courier New" w:eastAsia="Times New Roman" w:hAnsi="Courier New" w:cs="Courier New"/>
+          <w:kern w:val="0"/>
+          <w:sz w:val="20"/>
+          <w:szCs w:val="20"/>
+          <w:lang w:eastAsia="en-IN"/>
+          <w14:ligatures w14:val="none"/>
+        </w:rPr>
+        <w:t xml:space="preserve"> TESTING │   │</w:t>
+      </w:r>
+    </w:p>
+    <w:p>
+      <w:pPr>
+        <w:tabs>
+          <w:tab w:val="left" w:pos="916"/>
+          <w:tab w:val="left" w:pos="1832"/>
+          <w:tab w:val="left" w:pos="2748"/>
+          <w:tab w:val="left" w:pos="3664"/>
+          <w:tab w:val="left" w:pos="4580"/>
+          <w:tab w:val="left" w:pos="5496"/>
+          <w:tab w:val="left" w:pos="6412"/>
+          <w:tab w:val="left" w:pos="7328"/>
+          <w:tab w:val="left" w:pos="8244"/>
+          <w:tab w:val="left" w:pos="9160"/>
+          <w:tab w:val="left" w:pos="10076"/>
+          <w:tab w:val="left" w:pos="10992"/>
+          <w:tab w:val="left" w:pos="11908"/>
+          <w:tab w:val="left" w:pos="12824"/>
+          <w:tab w:val="left" w:pos="13740"/>
+          <w:tab w:val="left" w:pos="14656"/>
+        </w:tabs>
+        <w:spacing w:after="0" w:line="240" w:lineRule="auto"/>
+        <w:rPr>
+          <w:rFonts w:ascii="Courier New" w:eastAsia="Times New Roman" w:hAnsi="Courier New" w:cs="Courier New"/>
+          <w:kern w:val="0"/>
+          <w:sz w:val="20"/>
+          <w:szCs w:val="20"/>
+          <w:lang w:eastAsia="en-IN"/>
+          <w14:ligatures w14:val="none"/>
+        </w:rPr>
+      </w:pPr>
+      <w:r>
+        <w:rPr>
+          <w:rFonts w:ascii="Courier New" w:eastAsia="Times New Roman" w:hAnsi="Courier New" w:cs="Courier New"/>
+          <w:kern w:val="0"/>
+          <w:sz w:val="20"/>
+          <w:szCs w:val="20"/>
+          <w:lang w:eastAsia="en-IN"/>
+          <w14:ligatures w14:val="none"/>
+        </w:rPr>
+        <w:t xml:space="preserve">      │   │   ┌──────────────┐   │   │</w:t>
+      </w:r>
+    </w:p>
+    <w:p>
+      <w:pPr>
+        <w:tabs>
+          <w:tab w:val="left" w:pos="916"/>
+          <w:tab w:val="left" w:pos="1832"/>
+          <w:tab w:val="left" w:pos="2748"/>
+          <w:tab w:val="left" w:pos="3664"/>
+          <w:tab w:val="left" w:pos="4580"/>
+          <w:tab w:val="left" w:pos="5496"/>
+          <w:tab w:val="left" w:pos="6412"/>
+          <w:tab w:val="left" w:pos="7328"/>
+          <w:tab w:val="left" w:pos="8244"/>
+          <w:tab w:val="left" w:pos="9160"/>
+          <w:tab w:val="left" w:pos="10076"/>
+          <w:tab w:val="left" w:pos="10992"/>
+          <w:tab w:val="left" w:pos="11908"/>
+          <w:tab w:val="left" w:pos="12824"/>
+          <w:tab w:val="left" w:pos="13740"/>
+          <w:tab w:val="left" w:pos="14656"/>
+        </w:tabs>
+        <w:spacing w:after="0" w:line="240" w:lineRule="auto"/>
+        <w:rPr>
+          <w:rFonts w:ascii="Courier New" w:eastAsia="Times New Roman" w:hAnsi="Courier New" w:cs="Courier New"/>
+          <w:kern w:val="0"/>
+          <w:sz w:val="20"/>
+          <w:szCs w:val="20"/>
+          <w:lang w:eastAsia="en-IN"/>
+          <w14:ligatures w14:val="none"/>
+        </w:rPr>
+      </w:pPr>
+      <w:r>
+        <w:rPr>
+          <w:rFonts w:ascii="Courier New" w:eastAsia="Times New Roman" w:hAnsi="Courier New" w:cs="Courier New"/>
+          <w:kern w:val="0"/>
+          <w:sz w:val="20"/>
+          <w:szCs w:val="20"/>
+          <w:lang w:eastAsia="en-IN"/>
+          <w14:ligatures w14:val="none"/>
+        </w:rPr>
+        <w:t xml:space="preserve">      │   │   │ UNIT TESTING │   │   │</w:t>
+      </w:r>
+    </w:p>
+    <w:p>
+      <w:pPr>
+        <w:tabs>
+          <w:tab w:val="left" w:pos="916"/>
+          <w:tab w:val="left" w:pos="1832"/>
+          <w:tab w:val="left" w:pos="2748"/>
+          <w:tab w:val="left" w:pos="3664"/>
+          <w:tab w:val="left" w:pos="4580"/>
+          <w:tab w:val="left" w:pos="5496"/>
+          <w:tab w:val="left" w:pos="6412"/>
+          <w:tab w:val="left" w:pos="7328"/>
+          <w:tab w:val="left" w:pos="8244"/>
+          <w:tab w:val="left" w:pos="9160"/>
+          <w:tab w:val="left" w:pos="10076"/>
+          <w:tab w:val="left" w:pos="10992"/>
+          <w:tab w:val="left" w:pos="11908"/>
+          <w:tab w:val="left" w:pos="12824"/>
+          <w:tab w:val="left" w:pos="13740"/>
+          <w:tab w:val="left" w:pos="14656"/>
+        </w:tabs>
+        <w:spacing w:after="0" w:line="240" w:lineRule="auto"/>
+        <w:rPr>
+          <w:rFonts w:ascii="Courier New" w:eastAsia="Times New Roman" w:hAnsi="Courier New" w:cs="Courier New"/>
+          <w:kern w:val="0"/>
+          <w:sz w:val="20"/>
+          <w:szCs w:val="20"/>
+          <w:lang w:eastAsia="en-IN"/>
+          <w14:ligatures w14:val="none"/>
+        </w:rPr>
+      </w:pPr>
+      <w:r>
+        <w:rPr>
+          <w:rFonts w:ascii="Courier New" w:eastAsia="Times New Roman" w:hAnsi="Courier New" w:cs="Courier New"/>
+          <w:kern w:val="0"/>
+          <w:sz w:val="20"/>
+          <w:szCs w:val="20"/>
+          <w:lang w:eastAsia="en-IN"/>
+          <w14:ligatures w14:val="none"/>
+        </w:rPr>
+        <w:t xml:space="preserve">      │   │   └──────────────┘   │   │</w:t>
+      </w:r>
+    </w:p>
+    <w:p>
+      <w:pPr>
+        <w:tabs>
+          <w:tab w:val="left" w:pos="916"/>
+          <w:tab w:val="left" w:pos="1832"/>
+          <w:tab w:val="left" w:pos="2748"/>
+          <w:tab w:val="left" w:pos="3664"/>
+          <w:tab w:val="left" w:pos="4580"/>
+          <w:tab w:val="left" w:pos="5496"/>
+          <w:tab w:val="left" w:pos="6412"/>
+          <w:tab w:val="left" w:pos="7328"/>
+          <w:tab w:val="left" w:pos="8244"/>
+          <w:tab w:val="left" w:pos="9160"/>
+          <w:tab w:val="left" w:pos="10076"/>
+          <w:tab w:val="left" w:pos="10992"/>
+          <w:tab w:val="left" w:pos="11908"/>
+          <w:tab w:val="left" w:pos="12824"/>
+          <w:tab w:val="left" w:pos="13740"/>
+          <w:tab w:val="left" w:pos="14656"/>
+        </w:tabs>
+        <w:spacing w:after="0" w:line="240" w:lineRule="auto"/>
+        <w:rPr>
+          <w:rFonts w:ascii="Courier New" w:eastAsia="Times New Roman" w:hAnsi="Courier New" w:cs="Courier New"/>
+          <w:kern w:val="0"/>
+          <w:sz w:val="20"/>
+          <w:szCs w:val="20"/>
+          <w:lang w:eastAsia="en-IN"/>
+          <w14:ligatures w14:val="none"/>
+        </w:rPr>
+      </w:pPr>
+      <w:r>
+        <w:rPr>
+          <w:rFonts w:ascii="Courier New" w:eastAsia="Times New Roman" w:hAnsi="Courier New" w:cs="Courier New"/>
+          <w:kern w:val="0"/>
+          <w:sz w:val="20"/>
+          <w:szCs w:val="20"/>
+          <w:lang w:eastAsia="en-IN"/>
+          <w14:ligatures w14:val="none"/>
+        </w:rPr>
+        <w:t xml:space="preserve">      │   └──────────────────────┘   │</w:t>
+      </w:r>
+    </w:p>
+    <w:p>
+      <w:pPr>
+        <w:tabs>
+          <w:tab w:val="left" w:pos="916"/>
+          <w:tab w:val="left" w:pos="1832"/>
+          <w:tab w:val="left" w:pos="2748"/>
+          <w:tab w:val="left" w:pos="3664"/>
+          <w:tab w:val="left" w:pos="4580"/>
+          <w:tab w:val="left" w:pos="5496"/>
+          <w:tab w:val="left" w:pos="6412"/>
+          <w:tab w:val="left" w:pos="7328"/>
+          <w:tab w:val="left" w:pos="8244"/>
+          <w:tab w:val="left" w:pos="9160"/>
+          <w:tab w:val="left" w:pos="10076"/>
+          <w:tab w:val="left" w:pos="10992"/>
+          <w:tab w:val="left" w:pos="11908"/>
+          <w:tab w:val="left" w:pos="12824"/>
+          <w:tab w:val="left" w:pos="13740"/>
+          <w:tab w:val="left" w:pos="14656"/>
+        </w:tabs>
+        <w:spacing w:after="0" w:line="240" w:lineRule="auto"/>
+        <w:rPr>
+          <w:rFonts w:ascii="Courier New" w:eastAsia="Times New Roman" w:hAnsi="Courier New" w:cs="Courier New"/>
+          <w:kern w:val="0"/>
+          <w:sz w:val="20"/>
+          <w:szCs w:val="20"/>
+          <w:lang w:eastAsia="en-IN"/>
+          <w14:ligatures w14:val="none"/>
+        </w:rPr>
+      </w:pPr>
+      <w:r>
+        <w:rPr>
+          <w:rFonts w:ascii="Courier New" w:eastAsia="Times New Roman" w:hAnsi="Courier New" w:cs="Courier New"/>
+          <w:kern w:val="0"/>
+          <w:sz w:val="20"/>
+          <w:szCs w:val="20"/>
+          <w:lang w:eastAsia="en-IN"/>
+          <w14:ligatures w14:val="none"/>
+        </w:rPr>
+        <w:t xml:space="preserve">      └──────────────────────────────┘</w:t>
+      </w:r>
+    </w:p>
+    <w:p>
+      <w:pPr>
+        <w:spacing w:before="100" w:beforeAutospacing="1" w:after="100" w:afterAutospacing="1" w:line="240" w:lineRule="auto"/>
+        <w:outlineLvl w:val="2"/>
+        <w:rPr>
+          <w:rFonts w:ascii="Times New Roman" w:eastAsia="Times New Roman" w:hAnsi="Times New Roman" w:cs="Times New Roman"/>
+          <w:b/>
+          <w:bCs/>
+          <w:kern w:val="0"/>
+          <w:sz w:val="27"/>
+          <w:szCs w:val="27"/>
+          <w:lang w:eastAsia="en-IN"/>
+          <w14:ligatures w14:val="none"/>
+        </w:rPr>
+      </w:pPr>
+      <w:r>
+        <w:rPr>
+          <w:rFonts w:ascii="Times New Roman" w:eastAsia="Times New Roman" w:hAnsi="Times New Roman" w:cs="Times New Roman"/>
+          <w:b/>
+          <w:bCs/>
+          <w:kern w:val="0"/>
+          <w:sz w:val="27"/>
+          <w:szCs w:val="27"/>
+          <w:lang w:eastAsia="en-IN"/>
+          <w14:ligatures w14:val="none"/>
+        </w:rPr>
+        <w:t>1. Unit Testing</w:t>
+      </w:r>
+    </w:p>
+    <w:p>
+      <w:pPr>
+        <w:spacing w:before="100" w:beforeAutospacing="1" w:after="100" w:afterAutospacing="1" w:line="240" w:lineRule="auto"/>
+        <w:rPr>
+          <w:rFonts w:ascii="Times New Roman" w:eastAsia="Times New Roman" w:hAnsi="Times New Roman" w:cs="Times New Roman"/>
+          <w:kern w:val="0"/>
+          <w:sz w:val="24"/>
+          <w:szCs w:val="24"/>
+          <w:lang w:eastAsia="en-IN"/>
+          <w14:ligatures w14:val="none"/>
+        </w:rPr>
+      </w:pPr>
+      <w:r>
+        <w:rPr>
+          <w:rFonts w:ascii="Times New Roman" w:eastAsia="Times New Roman" w:hAnsi="Times New Roman" w:cs="Times New Roman"/>
+          <w:kern w:val="0"/>
+          <w:sz w:val="24"/>
+          <w:szCs w:val="24"/>
+          <w:lang w:eastAsia="en-IN"/>
+          <w14:ligatures w14:val="none"/>
+        </w:rPr>
+        <w:t>Interview answer: “Unit testing checks a single method or component independently.”</w:t>
+      </w:r>
+    </w:p>
+    <w:p>
+      <w:pPr>
+        <w:spacing w:before="100" w:beforeAutospacing="1" w:after="100" w:afterAutospacing="1" w:line="240" w:lineRule="auto"/>
+        <w:rPr>
+          <w:rFonts w:ascii="Times New Roman" w:eastAsia="Times New Roman" w:hAnsi="Times New Roman" w:cs="Times New Roman"/>
+          <w:kern w:val="0"/>
+          <w:sz w:val="24"/>
+          <w:szCs w:val="24"/>
+          <w:lang w:eastAsia="en-IN"/>
+          <w14:ligatures w14:val="none"/>
+        </w:rPr>
+      </w:pPr>
+      <w:r>
+        <w:rPr>
+          <w:rFonts w:ascii="Times New Roman" w:eastAsia="Times New Roman" w:hAnsi="Times New Roman" w:cs="Times New Roman"/>
+          <w:kern w:val="0"/>
+          <w:sz w:val="24"/>
+          <w:szCs w:val="24"/>
+          <w:lang w:eastAsia="en-IN"/>
+          <w14:ligatures w14:val="none"/>
+        </w:rPr>
+        <w:t>Example: Test whether a discount method correctly calculates a 10% discount.</w:t>
+      </w:r>
+    </w:p>
+    <w:p>
+      <w:pPr>
+        <w:spacing w:before="100" w:beforeAutospacing="1" w:after="100" w:afterAutospacing="1" w:line="240" w:lineRule="auto"/>
+        <w:rPr>
+          <w:rFonts w:ascii="Times New Roman" w:eastAsia="Times New Roman" w:hAnsi="Times New Roman" w:cs="Times New Roman"/>
+          <w:kern w:val="0"/>
+          <w:sz w:val="24"/>
+          <w:szCs w:val="24"/>
+          <w:lang w:eastAsia="en-IN"/>
+          <w14:ligatures w14:val="none"/>
+        </w:rPr>
+      </w:pPr>
+      <w:r>
+        <w:rPr>
+          <w:rFonts w:ascii="Times New Roman" w:eastAsia="Times New Roman" w:hAnsi="Times New Roman" w:cs="Times New Roman"/>
+          <w:kern w:val="0"/>
+          <w:sz w:val="24"/>
+          <w:szCs w:val="24"/>
+          <w:lang w:eastAsia="en-IN"/>
+          <w14:ligatures w14:val="none"/>
+        </w:rPr>
+        <w:t>Tool: JUnit.</w:t>
+      </w:r>
+    </w:p>
+    <w:p>
+      <w:pPr>
+        <w:spacing w:before="100" w:beforeAutospacing="1" w:after="100" w:afterAutospacing="1" w:line="240" w:lineRule="auto"/>
+        <w:outlineLvl w:val="2"/>
+        <w:rPr>
+          <w:rFonts w:ascii="Times New Roman" w:eastAsia="Times New Roman" w:hAnsi="Times New Roman" w:cs="Times New Roman"/>
+          <w:b/>
+          <w:bCs/>
+          <w:kern w:val="0"/>
+          <w:sz w:val="27"/>
+          <w:szCs w:val="27"/>
+          <w:lang w:eastAsia="en-IN"/>
+          <w14:ligatures w14:val="none"/>
+        </w:rPr>
+      </w:pPr>
+      <w:r>
+        <w:rPr>
+          <w:rFonts w:ascii="Times New Roman" w:eastAsia="Times New Roman" w:hAnsi="Times New Roman" w:cs="Times New Roman"/>
+          <w:b/>
+          <w:bCs/>
+          <w:kern w:val="0"/>
+          <w:sz w:val="27"/>
+          <w:szCs w:val="27"/>
+          <w:lang w:eastAsia="en-IN"/>
+          <w14:ligatures w14:val="none"/>
+        </w:rPr>
+        <w:t>2. Integration Testing</w:t>
+      </w:r>
+    </w:p>
+    <w:p>
+      <w:pPr>
+        <w:spacing w:before="100" w:beforeAutospacing="1" w:after="100" w:afterAutospacing="1" w:line="240" w:lineRule="auto"/>
+        <w:rPr>
+          <w:rFonts w:ascii="Times New Roman" w:eastAsia="Times New Roman" w:hAnsi="Times New Roman" w:cs="Times New Roman"/>
+          <w:kern w:val="0"/>
+          <w:sz w:val="24"/>
+          <w:szCs w:val="24"/>
+          <w:lang w:eastAsia="en-IN"/>
+          <w14:ligatures w14:val="none"/>
+        </w:rPr>
+      </w:pPr>
+      <w:r>
+        <w:rPr>
+          <w:rFonts w:ascii="Times New Roman" w:eastAsia="Times New Roman" w:hAnsi="Times New Roman" w:cs="Times New Roman"/>
+          <w:kern w:val="0"/>
+          <w:sz w:val="24"/>
+          <w:szCs w:val="24"/>
+          <w:lang w:eastAsia="en-IN"/>
+          <w14:ligatures w14:val="none"/>
+        </w:rPr>
+        <w:t>Interview answer: “Integration testing checks whether multiple components work correctly together.”</w:t>
+      </w:r>
+    </w:p>
+    <w:p>
+      <w:pPr>
+        <w:spacing w:before="100" w:beforeAutospacing="1" w:after="100" w:afterAutospacing="1" w:line="240" w:lineRule="auto"/>
+        <w:rPr>
+          <w:rFonts w:ascii="Times New Roman" w:eastAsia="Times New Roman" w:hAnsi="Times New Roman" w:cs="Times New Roman"/>
+          <w:kern w:val="0"/>
+          <w:sz w:val="24"/>
+          <w:szCs w:val="24"/>
+          <w:lang w:eastAsia="en-IN"/>
+          <w14:ligatures w14:val="none"/>
+        </w:rPr>
+      </w:pPr>
+      <w:r>
+        <w:rPr>
+          <w:rFonts w:ascii="Times New Roman" w:eastAsia="Times New Roman" w:hAnsi="Times New Roman" w:cs="Times New Roman"/>
+          <w:kern w:val="0"/>
+          <w:sz w:val="24"/>
+          <w:szCs w:val="24"/>
+          <w:lang w:eastAsia="en-IN"/>
+          <w14:ligatures w14:val="none"/>
+        </w:rPr>
+        <w:t>Example: Check whether the order service correctly communicates with the database to save an order.</w:t>
+      </w:r>
+    </w:p>
+    <w:p>
+      <w:pPr>
+        <w:spacing w:before="100" w:beforeAutospacing="1" w:after="100" w:afterAutospacing="1" w:line="240" w:lineRule="auto"/>
+        <w:outlineLvl w:val="2"/>
+        <w:rPr>
+          <w:rFonts w:ascii="Times New Roman" w:eastAsia="Times New Roman" w:hAnsi="Times New Roman" w:cs="Times New Roman"/>
+          <w:b/>
+          <w:bCs/>
+          <w:kern w:val="0"/>
+          <w:sz w:val="27"/>
+          <w:szCs w:val="27"/>
+          <w:lang w:eastAsia="en-IN"/>
+          <w14:ligatures w14:val="none"/>
+        </w:rPr>
+      </w:pPr>
+      <w:r>
+        <w:rPr>
+          <w:rFonts w:ascii="Times New Roman" w:eastAsia="Times New Roman" w:hAnsi="Times New Roman" w:cs="Times New Roman"/>
+          <w:b/>
+          <w:bCs/>
+          <w:kern w:val="0"/>
+          <w:sz w:val="27"/>
+          <w:szCs w:val="27"/>
+          <w:lang w:eastAsia="en-IN"/>
+          <w14:ligatures w14:val="none"/>
+        </w:rPr>
+        <w:t>3. Functional Testing</w:t>
+      </w:r>
+    </w:p>
+    <w:p>
+      <w:pPr>
+        <w:spacing w:before="100" w:beforeAutospacing="1" w:after="100" w:afterAutospacing="1" w:line="240" w:lineRule="auto"/>
+        <w:rPr>
+          <w:rFonts w:ascii="Times New Roman" w:eastAsia="Times New Roman" w:hAnsi="Times New Roman" w:cs="Times New Roman"/>
+          <w:kern w:val="0"/>
+          <w:sz w:val="24"/>
+          <w:szCs w:val="24"/>
+          <w:lang w:eastAsia="en-IN"/>
+          <w14:ligatures w14:val="none"/>
+        </w:rPr>
+      </w:pPr>
+      <w:r>
+        <w:rPr>
+          <w:rFonts w:ascii="Times New Roman" w:eastAsia="Times New Roman" w:hAnsi="Times New Roman" w:cs="Times New Roman"/>
+          <w:kern w:val="0"/>
+          <w:sz w:val="24"/>
+          <w:szCs w:val="24"/>
+          <w:lang w:eastAsia="en-IN"/>
+          <w14:ligatures w14:val="none"/>
+        </w:rPr>
+        <w:t>Interview answer: “Functional testing checks whether an application feature behaves according to its requirements.”</w:t>
+      </w:r>
+    </w:p>
+    <w:p>
+      <w:pPr>
+        <w:spacing w:before="100" w:beforeAutospacing="1" w:after="100" w:afterAutospacing="1" w:line="240" w:lineRule="auto"/>
+        <w:rPr>
+          <w:rFonts w:ascii="Times New Roman" w:eastAsia="Times New Roman" w:hAnsi="Times New Roman" w:cs="Times New Roman"/>
+          <w:kern w:val="0"/>
+          <w:sz w:val="24"/>
+          <w:szCs w:val="24"/>
+          <w:lang w:eastAsia="en-IN"/>
+          <w14:ligatures w14:val="none"/>
+        </w:rPr>
+      </w:pPr>
+      <w:r>
+        <w:rPr>
+          <w:rFonts w:ascii="Times New Roman" w:eastAsia="Times New Roman" w:hAnsi="Times New Roman" w:cs="Times New Roman"/>
+          <w:kern w:val="0"/>
+          <w:sz w:val="24"/>
+          <w:szCs w:val="24"/>
+          <w:lang w:eastAsia="en-IN"/>
+          <w14:ligatures w14:val="none"/>
+        </w:rPr>
+        <w:t>Example: Verify that a customer can log in, add a product to the cart, and place an order as expected.</w:t>
+      </w:r>
+    </w:p>
+    <w:p>
+      <w:pPr>
+        <w:spacing w:before="100" w:beforeAutospacing="1" w:after="100" w:afterAutospacing="1" w:line="240" w:lineRule="auto"/>
+        <w:outlineLvl w:val="2"/>
+        <w:rPr>
+          <w:rFonts w:ascii="Times New Roman" w:eastAsia="Times New Roman" w:hAnsi="Times New Roman" w:cs="Times New Roman"/>
+          <w:b/>
+          <w:bCs/>
+          <w:kern w:val="0"/>
+          <w:sz w:val="27"/>
+          <w:szCs w:val="27"/>
+          <w:lang w:eastAsia="en-IN"/>
+          <w14:ligatures w14:val="none"/>
+        </w:rPr>
+      </w:pPr>
+      <w:r>
+        <w:rPr>
+          <w:rFonts w:ascii="Times New Roman" w:eastAsia="Times New Roman" w:hAnsi="Times New Roman" w:cs="Times New Roman"/>
+          <w:b/>
+          <w:bCs/>
+          <w:kern w:val="0"/>
+          <w:sz w:val="27"/>
+          <w:szCs w:val="27"/>
+          <w:lang w:eastAsia="en-IN"/>
+          <w14:ligatures w14:val="none"/>
+        </w:rPr>
+        <w:t>Real-life example: Online shopping</w:t>
+      </w:r>
+    </w:p>
+    <w:tbl>
+      <w:tblPr>
+        <w:tblW w:w="0" w:type="auto"/>
+        <w:tblCellSpacing w:w="15" w:type="dxa"/>
+        <w:tblCellMar>
+          <w:top w:w="15" w:type="dxa"/>
+          <w:left w:w="15" w:type="dxa"/>
+          <w:bottom w:w="15" w:type="dxa"/>
+          <w:right w:w="15" w:type="dxa"/>
+        </w:tblCellMar>
+        <w:tblLook w:val="04A0" w:firstRow="1" w:lastRow="0" w:firstColumn="1" w:lastColumn="0" w:noHBand="0" w:noVBand="1"/>
+      </w:tblPr>
+      <w:tblGrid>
+        <w:gridCol w:w="1128"/>
+        <w:gridCol w:w="5226"/>
+      </w:tblGrid>
+      <w:tr>
+        <w:trPr>
+          <w:tblCellSpacing w:w="15" w:type="dxa"/>
+        </w:trPr>
+        <w:tc>
+          <w:tcPr>
+            <w:tcW w:w="0" w:type="auto"/>
+            <w:vAlign w:val="center"/>
+            <w:hideMark/>
+          </w:tcPr>
+          <w:p>
+            <w:pPr>
+              <w:spacing w:before="100" w:beforeAutospacing="1" w:after="100" w:afterAutospacing="1" w:line="240" w:lineRule="auto"/>
+              <w:jc w:val="center"/>
+              <w:rPr>
+                <w:rFonts w:ascii="Times New Roman" w:eastAsia="Times New Roman" w:hAnsi="Times New Roman" w:cs="Times New Roman"/>
+                <w:b/>
+                <w:bCs/>
+                <w:kern w:val="0"/>
+                <w:sz w:val="24"/>
+                <w:szCs w:val="24"/>
+                <w:lang w:eastAsia="en-IN"/>
+                <w14:ligatures w14:val="none"/>
+              </w:rPr>
+            </w:pPr>
+            <w:r>
+              <w:rPr>
+                <w:rFonts w:ascii="Times New Roman" w:eastAsia="Times New Roman" w:hAnsi="Times New Roman" w:cs="Times New Roman"/>
+                <w:b/>
+                <w:bCs/>
+                <w:kern w:val="0"/>
+                <w:sz w:val="24"/>
+                <w:szCs w:val="24"/>
+                <w:lang w:eastAsia="en-IN"/>
+                <w14:ligatures w14:val="none"/>
+              </w:rPr>
+              <w:t>Type</w:t>
+            </w:r>
+          </w:p>
+        </w:tc>
+        <w:tc>
+          <w:tcPr>
+            <w:tcW w:w="0" w:type="auto"/>
+            <w:vAlign w:val="center"/>
+            <w:hideMark/>
+          </w:tcPr>
+          <w:p>
+            <w:pPr>
+              <w:spacing w:before="100" w:beforeAutospacing="1" w:after="100" w:afterAutospacing="1" w:line="240" w:lineRule="auto"/>
+              <w:jc w:val="center"/>
+              <w:rPr>
+                <w:rFonts w:ascii="Times New Roman" w:eastAsia="Times New Roman" w:hAnsi="Times New Roman" w:cs="Times New Roman"/>
+                <w:b/>
+                <w:bCs/>
+                <w:kern w:val="0"/>
+                <w:sz w:val="24"/>
+                <w:szCs w:val="24"/>
+                <w:lang w:eastAsia="en-IN"/>
+                <w14:ligatures w14:val="none"/>
+              </w:rPr>
+            </w:pPr>
+            <w:r>
+              <w:rPr>
+                <w:rFonts w:ascii="Times New Roman" w:eastAsia="Times New Roman" w:hAnsi="Times New Roman" w:cs="Times New Roman"/>
+                <w:b/>
+                <w:bCs/>
+                <w:kern w:val="0"/>
+                <w:sz w:val="24"/>
+                <w:szCs w:val="24"/>
+                <w:lang w:eastAsia="en-IN"/>
+                <w14:ligatures w14:val="none"/>
+              </w:rPr>
+              <w:t>What you test</w:t>
+            </w:r>
+          </w:p>
+        </w:tc>
+      </w:tr>
+      <w:tr>
+        <w:trPr>
+          <w:tblCellSpacing w:w="15" w:type="dxa"/>
+        </w:trPr>
+        <w:tc>
+          <w:tcPr>
+            <w:tcW w:w="0" w:type="auto"/>
+            <w:vAlign w:val="center"/>
+            <w:hideMark/>
+          </w:tcPr>
+          <w:p>
+            <w:pPr>
+              <w:spacing w:before="100" w:beforeAutospacing="1" w:after="100" w:afterAutospacing="1" w:line="240" w:lineRule="auto"/>
+              <w:rPr>
+                <w:rFonts w:ascii="Times New Roman" w:eastAsia="Times New Roman" w:hAnsi="Times New Roman" w:cs="Times New Roman"/>
+                <w:kern w:val="0"/>
+                <w:sz w:val="24"/>
+                <w:szCs w:val="24"/>
+                <w:lang w:eastAsia="en-IN"/>
+                <w14:ligatures w14:val="none"/>
+              </w:rPr>
+            </w:pPr>
+            <w:r>
+              <w:rPr>
+                <w:rFonts w:ascii="Times New Roman" w:eastAsia="Times New Roman" w:hAnsi="Times New Roman" w:cs="Times New Roman"/>
+                <w:kern w:val="0"/>
+                <w:sz w:val="24"/>
+                <w:szCs w:val="24"/>
+                <w:lang w:eastAsia="en-IN"/>
+                <w14:ligatures w14:val="none"/>
+              </w:rPr>
+              <w:t>Unit</w:t>
+            </w:r>
+          </w:p>
+        </w:tc>
+        <w:tc>
+          <w:tcPr>
+            <w:tcW w:w="0" w:type="auto"/>
+            <w:vAlign w:val="center"/>
+            <w:hideMark/>
+          </w:tcPr>
+          <w:p>
+            <w:pPr>
+              <w:spacing w:before="100" w:beforeAutospacing="1" w:after="100" w:afterAutospacing="1" w:line="240" w:lineRule="auto"/>
+              <w:rPr>
+                <w:rFonts w:ascii="Times New Roman" w:eastAsia="Times New Roman" w:hAnsi="Times New Roman" w:cs="Times New Roman"/>
+                <w:kern w:val="0"/>
+                <w:sz w:val="24"/>
+                <w:szCs w:val="24"/>
+                <w:lang w:eastAsia="en-IN"/>
+                <w14:ligatures w14:val="none"/>
+              </w:rPr>
+            </w:pPr>
+            <w:r>
+              <w:rPr>
+                <w:rFonts w:ascii="Times New Roman" w:eastAsia="Times New Roman" w:hAnsi="Times New Roman" w:cs="Times New Roman"/>
+                <w:kern w:val="0"/>
+                <w:sz w:val="24"/>
+                <w:szCs w:val="24"/>
+                <w:lang w:eastAsia="en-IN"/>
+                <w14:ligatures w14:val="none"/>
+              </w:rPr>
+              <w:t>Does the discount calculation work?</w:t>
+            </w:r>
+          </w:p>
+        </w:tc>
+      </w:tr>
+      <w:tr>
+        <w:trPr>
+          <w:tblCellSpacing w:w="15" w:type="dxa"/>
+        </w:trPr>
+        <w:tc>
+          <w:tcPr>
+            <w:tcW w:w="0" w:type="auto"/>
+            <w:vAlign w:val="center"/>
+            <w:hideMark/>
+          </w:tcPr>
+          <w:p>
+            <w:pPr>
+              <w:spacing w:before="100" w:beforeAutospacing="1" w:after="100" w:afterAutospacing="1" w:line="240" w:lineRule="auto"/>
+              <w:rPr>
+                <w:rFonts w:ascii="Times New Roman" w:eastAsia="Times New Roman" w:hAnsi="Times New Roman" w:cs="Times New Roman"/>
+                <w:kern w:val="0"/>
+                <w:sz w:val="24"/>
+                <w:szCs w:val="24"/>
+                <w:lang w:eastAsia="en-IN"/>
+                <w14:ligatures w14:val="none"/>
+              </w:rPr>
+            </w:pPr>
+            <w:r>
+              <w:rPr>
+                <w:rFonts w:ascii="Times New Roman" w:eastAsia="Times New Roman" w:hAnsi="Times New Roman" w:cs="Times New Roman"/>
+                <w:kern w:val="0"/>
+                <w:sz w:val="24"/>
+                <w:szCs w:val="24"/>
+                <w:lang w:eastAsia="en-IN"/>
+                <w14:ligatures w14:val="none"/>
+              </w:rPr>
+              <w:t>Integration</w:t>
+            </w:r>
+          </w:p>
+        </w:tc>
+        <w:tc>
+          <w:tcPr>
+            <w:tcW w:w="0" w:type="auto"/>
+            <w:vAlign w:val="center"/>
+            <w:hideMark/>
+          </w:tcPr>
+          <w:p>
+            <w:pPr>
+              <w:spacing w:before="100" w:beforeAutospacing="1" w:after="100" w:afterAutospacing="1" w:line="240" w:lineRule="auto"/>
+              <w:rPr>
+                <w:rFonts w:ascii="Times New Roman" w:eastAsia="Times New Roman" w:hAnsi="Times New Roman" w:cs="Times New Roman"/>
+                <w:kern w:val="0"/>
+                <w:sz w:val="24"/>
+                <w:szCs w:val="24"/>
+                <w:lang w:eastAsia="en-IN"/>
+                <w14:ligatures w14:val="none"/>
+              </w:rPr>
+            </w:pPr>
+            <w:r>
+              <w:rPr>
+                <w:rFonts w:ascii="Times New Roman" w:eastAsia="Times New Roman" w:hAnsi="Times New Roman" w:cs="Times New Roman"/>
+                <w:kern w:val="0"/>
+                <w:sz w:val="24"/>
+                <w:szCs w:val="24"/>
+                <w:lang w:eastAsia="en-IN"/>
+                <w14:ligatures w14:val="none"/>
+              </w:rPr>
+              <w:t>Does the order service save the order in the database?</w:t>
+            </w:r>
+          </w:p>
+        </w:tc>
+      </w:tr>
+      <w:tr>
+        <w:trPr>
+          <w:tblCellSpacing w:w="15" w:type="dxa"/>
+        </w:trPr>
+        <w:tc>
+          <w:tcPr>
+            <w:tcW w:w="0" w:type="auto"/>
+            <w:vAlign w:val="center"/>
+            <w:hideMark/>
+          </w:tcPr>
+          <w:p>
+            <w:pPr>
+              <w:spacing w:before="100" w:beforeAutospacing="1" w:after="100" w:afterAutospacing="1" w:line="240" w:lineRule="auto"/>
+              <w:rPr>
+                <w:rFonts w:ascii="Times New Roman" w:eastAsia="Times New Roman" w:hAnsi="Times New Roman" w:cs="Times New Roman"/>
+                <w:kern w:val="0"/>
+                <w:sz w:val="24"/>
+                <w:szCs w:val="24"/>
+                <w:lang w:eastAsia="en-IN"/>
+                <w14:ligatures w14:val="none"/>
+              </w:rPr>
+            </w:pPr>
+            <w:r>
+              <w:rPr>
+                <w:rFonts w:ascii="Times New Roman" w:eastAsia="Times New Roman" w:hAnsi="Times New Roman" w:cs="Times New Roman"/>
+                <w:kern w:val="0"/>
+                <w:sz w:val="24"/>
+                <w:szCs w:val="24"/>
+                <w:lang w:eastAsia="en-IN"/>
+                <w14:ligatures w14:val="none"/>
+              </w:rPr>
+              <w:t>Functional</w:t>
+            </w:r>
+          </w:p>
+        </w:tc>
+        <w:tc>
+          <w:tcPr>
+            <w:tcW w:w="0" w:type="auto"/>
+            <w:vAlign w:val="center"/>
+            <w:hideMark/>
+          </w:tcPr>
+          <w:p>
+            <w:pPr>
+              <w:spacing w:before="100" w:beforeAutospacing="1" w:after="100" w:afterAutospacing="1" w:line="240" w:lineRule="auto"/>
+              <w:rPr>
+                <w:rFonts w:ascii="Times New Roman" w:eastAsia="Times New Roman" w:hAnsi="Times New Roman" w:cs="Times New Roman"/>
+                <w:kern w:val="0"/>
+                <w:sz w:val="24"/>
+                <w:szCs w:val="24"/>
+                <w:lang w:eastAsia="en-IN"/>
+                <w14:ligatures w14:val="none"/>
+              </w:rPr>
+            </w:pPr>
+            <w:r>
+              <w:rPr>
+                <w:rFonts w:ascii="Times New Roman" w:eastAsia="Times New Roman" w:hAnsi="Times New Roman" w:cs="Times New Roman"/>
+                <w:kern w:val="0"/>
+                <w:sz w:val="24"/>
+                <w:szCs w:val="24"/>
+                <w:lang w:eastAsia="en-IN"/>
+                <w14:ligatures w14:val="none"/>
+              </w:rPr>
+              <w:t>Can the customer successfully place an order?</w:t>
+            </w:r>
+          </w:p>
+        </w:tc>
+      </w:tr>
+    </w:tbl>
+    <w:p>
+      <w:pPr>
+        <w:spacing w:before="100" w:beforeAutospacing="1" w:after="100" w:afterAutospacing="1" w:line="240" w:lineRule="auto"/>
+        <w:rPr>
+          <w:rFonts w:ascii="Times New Roman" w:eastAsia="Times New Roman" w:hAnsi="Times New Roman" w:cs="Times New Roman"/>
+          <w:kern w:val="0"/>
+          <w:sz w:val="24"/>
+          <w:szCs w:val="24"/>
+          <w:lang w:eastAsia="en-IN"/>
+          <w14:ligatures w14:val="none"/>
+        </w:rPr>
+      </w:pPr>
+      <w:r>
+        <w:rPr>
+          <w:rFonts w:ascii="Times New Roman" w:eastAsia="Times New Roman" w:hAnsi="Times New Roman" w:cs="Times New Roman"/>
+          <w:kern w:val="0"/>
+          <w:sz w:val="24"/>
+          <w:szCs w:val="24"/>
+          <w:lang w:eastAsia="en-IN"/>
+          <w14:ligatures w14:val="none"/>
+        </w:rPr>
+        <w:t>Remember: Unit = individual component; Integration = components working together; Functional = required application behaviour.</w:t>
+      </w:r>
+    </w:p>
+    <w:p>
+      <w:pPr>
+        <w:spacing w:before="100" w:beforeAutospacing="1" w:after="100" w:afterAutospacing="1" w:line="240" w:lineRule="auto"/>
+        <w:rPr>
+          <w:rFonts w:ascii="Times New Roman" w:eastAsia="Times New Roman" w:hAnsi="Times New Roman" w:cs="Times New Roman"/>
+          <w:kern w:val="0"/>
+          <w:sz w:val="24"/>
+          <w:szCs w:val="24"/>
+          <w:lang w:eastAsia="en-IN"/>
+          <w14:ligatures w14:val="none"/>
+        </w:rPr>
+      </w:pPr>
+      <w:r>
+        <w:rPr>
+          <w:rFonts w:ascii="Times New Roman" w:eastAsia="Times New Roman" w:hAnsi="Times New Roman" w:cs="Times New Roman"/>
+          <w:kern w:val="0"/>
+          <w:sz w:val="24"/>
+          <w:szCs w:val="24"/>
+          <w:lang w:eastAsia="en-IN"/>
+          <w14:ligatures w14:val="none"/>
+        </w:rPr>
+        <w:lastRenderedPageBreak/>
+        <w:t>Note: The nested-circle diagram is a simplified illustration. These testing categories can overlap; functional testing is not strictly a larger level that always contains unit and integration testing.</w:t>
+      </w:r>
+    </w:p>
+    <w:p>
+      <w:pPr>
+        <w:rPr>
+          <w:sz w:val="36"/>
+          <w:szCs w:val="36"/>
+          <w:lang w:val="en-US"/>
+        </w:rPr>
+      </w:pPr>
+      <w:r>
+        <w:rPr>
+          <w:noProof/>
+          <w:sz w:val="36"/>
+          <w:szCs w:val="36"/>
+          <w:lang w:val="en-US"/>
+        </w:rPr>
+        <w:drawing>
+          <wp:inline distT="0" distB="0" distL="0" distR="0" wp14:anchorId="2E3290D2" wp14:editId="7A370A00">
+            <wp:extent cx="4314825" cy="2871787"/>
+            <wp:effectExtent l="0" t="0" r="0" b="5080"/>
+            <wp:docPr id="1140763099" name="Picture 1"/>
+            <wp:cNvGraphicFramePr>
+              <a:graphicFrameLocks xmlns:a="http://schemas.openxmlformats.org/drawingml/2006/main" noChangeAspect="1"/>
+            </wp:cNvGraphicFramePr>
+            <a:graphic xmlns:a="http://schemas.openxmlformats.org/drawingml/2006/main">
+              <a:graphicData uri="http://schemas.openxmlformats.org/drawingml/2006/picture">
+                <pic:pic xmlns:pic="http://schemas.openxmlformats.org/drawingml/2006/picture">
+                  <pic:nvPicPr>
+                    <pic:cNvPr id="0" name="Picture 2"/>
+                    <pic:cNvPicPr>
+                      <a:picLocks noChangeAspect="1" noChangeArrowheads="1"/>
+                    </pic:cNvPicPr>
+                  </pic:nvPicPr>
+                  <pic:blipFill>
+                    <a:blip r:embed="rId11">
+                      <a:extLst>
+                        <a:ext uri="{28A0092B-C50C-407E-A947-70E740481C1C}">
+                          <a14:useLocalDpi xmlns:a14="http://schemas.microsoft.com/office/drawing/2010/main" val="0"/>
+                        </a:ext>
+                      </a:extLst>
+                    </a:blip>
+                    <a:srcRect/>
+                    <a:stretch>
+                      <a:fillRect/>
+                    </a:stretch>
+                  </pic:blipFill>
+                  <pic:spPr bwMode="auto">
+                    <a:xfrm>
+                      <a:off x="0" y="0"/>
+                      <a:ext cx="4319627" cy="2874983"/>
+                    </a:xfrm>
+                    <a:prstGeom prst="rect">
+                      <a:avLst/>
+                    </a:prstGeom>
+                    <a:noFill/>
+                  </pic:spPr>
+                </pic:pic>
+              </a:graphicData>
+            </a:graphic>
+          </wp:inline>
+        </w:drawing>
+      </w:r>
+    </w:p>
+    <w:p>
+      <w:pPr>
+        <w:spacing w:before="100" w:beforeAutospacing="1" w:after="100" w:afterAutospacing="1" w:line="240" w:lineRule="auto"/>
+        <w:outlineLvl w:val="1"/>
+        <w:rPr>
+          <w:rFonts w:ascii="Times New Roman" w:eastAsia="Times New Roman" w:hAnsi="Times New Roman" w:cs="Times New Roman"/>
+          <w:b/>
+          <w:bCs/>
+          <w:kern w:val="0"/>
+          <w:sz w:val="36"/>
+          <w:szCs w:val="36"/>
+          <w:lang w:eastAsia="en-IN"/>
+          <w14:ligatures w14:val="none"/>
+        </w:rPr>
+      </w:pPr>
+      <w:r>
+        <w:rPr>
+          <w:rFonts w:ascii="Times New Roman" w:eastAsia="Times New Roman" w:hAnsi="Times New Roman" w:cs="Times New Roman"/>
+          <w:b/>
+          <w:bCs/>
+          <w:kern w:val="0"/>
+          <w:sz w:val="36"/>
+          <w:szCs w:val="36"/>
+          <w:lang w:eastAsia="en-IN"/>
+          <w14:ligatures w14:val="none"/>
+        </w:rPr>
+        <w:t>2. Integration Testing</w:t>
+      </w:r>
+    </w:p>
+    <w:p>
+      <w:pPr>
+        <w:spacing w:before="100" w:beforeAutospacing="1" w:after="100" w:afterAutospacing="1" w:line="240" w:lineRule="auto"/>
+        <w:rPr>
+          <w:rFonts w:ascii="Times New Roman" w:eastAsia="Times New Roman" w:hAnsi="Times New Roman" w:cs="Times New Roman"/>
+          <w:kern w:val="0"/>
+          <w:sz w:val="24"/>
+          <w:szCs w:val="24"/>
+          <w:lang w:eastAsia="en-IN"/>
+          <w14:ligatures w14:val="none"/>
+        </w:rPr>
+      </w:pPr>
+      <w:r>
+        <w:rPr>
+          <w:rFonts w:ascii="Times New Roman" w:eastAsia="Times New Roman" w:hAnsi="Times New Roman" w:cs="Times New Roman"/>
+          <w:kern w:val="0"/>
+          <w:sz w:val="24"/>
+          <w:szCs w:val="24"/>
+          <w:lang w:eastAsia="en-IN"/>
+          <w14:ligatures w14:val="none"/>
+        </w:rPr>
+        <w:t>Interview answer:</w:t>
+      </w:r>
+    </w:p>
+    <w:p>
+      <w:pPr>
+        <w:spacing w:before="100" w:beforeAutospacing="1" w:after="100" w:afterAutospacing="1" w:line="240" w:lineRule="auto"/>
+        <w:rPr>
+          <w:rFonts w:ascii="Times New Roman" w:eastAsia="Times New Roman" w:hAnsi="Times New Roman" w:cs="Times New Roman"/>
+          <w:kern w:val="0"/>
+          <w:sz w:val="24"/>
+          <w:szCs w:val="24"/>
+          <w:lang w:eastAsia="en-IN"/>
+          <w14:ligatures w14:val="none"/>
+        </w:rPr>
+      </w:pPr>
+      <w:r>
+        <w:rPr>
+          <w:rFonts w:ascii="Times New Roman" w:eastAsia="Times New Roman" w:hAnsi="Times New Roman" w:cs="Times New Roman"/>
+          <w:kern w:val="0"/>
+          <w:sz w:val="24"/>
+          <w:szCs w:val="24"/>
+          <w:lang w:eastAsia="en-IN"/>
+          <w14:ligatures w14:val="none"/>
+        </w:rPr>
+        <w:t>“Integration testing verifies whether different components or dependencies work correctly together. For example, I check whether the service communicates with the database correctly and whether the data is successfully saved.”</w:t>
+      </w:r>
+    </w:p>
+    <w:p>
+      <w:pPr>
+        <w:spacing w:before="100" w:beforeAutospacing="1" w:after="100" w:afterAutospacing="1" w:line="240" w:lineRule="auto"/>
+        <w:rPr>
+          <w:rFonts w:ascii="Times New Roman" w:eastAsia="Times New Roman" w:hAnsi="Times New Roman" w:cs="Times New Roman"/>
+          <w:kern w:val="0"/>
+          <w:sz w:val="24"/>
+          <w:szCs w:val="24"/>
+          <w:lang w:eastAsia="en-IN"/>
+          <w14:ligatures w14:val="none"/>
+        </w:rPr>
+      </w:pPr>
+      <w:r>
+        <w:rPr>
+          <w:rFonts w:ascii="Times New Roman" w:eastAsia="Times New Roman" w:hAnsi="Times New Roman" w:cs="Times New Roman"/>
+          <w:kern w:val="0"/>
+          <w:sz w:val="24"/>
+          <w:szCs w:val="24"/>
+          <w:lang w:eastAsia="en-IN"/>
+          <w14:ligatures w14:val="none"/>
+        </w:rPr>
+        <w:t>Example 1: Database integration</w:t>
+      </w:r>
+    </w:p>
+    <w:p>
+      <w:pPr>
+        <w:tabs>
+          <w:tab w:val="left" w:pos="916"/>
+          <w:tab w:val="left" w:pos="1832"/>
+          <w:tab w:val="left" w:pos="2748"/>
+          <w:tab w:val="left" w:pos="3664"/>
+          <w:tab w:val="left" w:pos="4580"/>
+          <w:tab w:val="left" w:pos="5496"/>
+          <w:tab w:val="left" w:pos="6412"/>
+          <w:tab w:val="left" w:pos="7328"/>
+          <w:tab w:val="left" w:pos="8244"/>
+          <w:tab w:val="left" w:pos="9160"/>
+          <w:tab w:val="left" w:pos="10076"/>
+          <w:tab w:val="left" w:pos="10992"/>
+          <w:tab w:val="left" w:pos="11908"/>
+          <w:tab w:val="left" w:pos="12824"/>
+          <w:tab w:val="left" w:pos="13740"/>
+          <w:tab w:val="left" w:pos="14656"/>
+        </w:tabs>
+        <w:spacing w:after="0" w:line="240" w:lineRule="auto"/>
+        <w:rPr>
+          <w:rFonts w:ascii="Courier New" w:eastAsia="Times New Roman" w:hAnsi="Courier New" w:cs="Courier New"/>
+          <w:kern w:val="0"/>
+          <w:sz w:val="20"/>
+          <w:szCs w:val="20"/>
+          <w:lang w:eastAsia="en-IN"/>
+          <w14:ligatures w14:val="none"/>
+        </w:rPr>
+      </w:pPr>
+      <w:r>
+        <w:rPr>
+          <w:rFonts w:ascii="Courier New" w:eastAsia="Times New Roman" w:hAnsi="Courier New" w:cs="Courier New"/>
+          <w:kern w:val="0"/>
+          <w:sz w:val="20"/>
+          <w:szCs w:val="20"/>
+          <w:lang w:eastAsia="en-IN"/>
+          <w14:ligatures w14:val="none"/>
+        </w:rPr>
+        <w:t>Service → Database → Verify saved data</w:t>
+      </w:r>
+    </w:p>
+    <w:p>
+      <w:pPr>
+        <w:numPr>
+          <w:ilvl w:val="0"/>
+          <w:numId w:val="20"/>
+        </w:numPr>
+        <w:spacing w:before="100" w:beforeAutospacing="1" w:after="100" w:afterAutospacing="1" w:line="240" w:lineRule="auto"/>
+        <w:rPr>
+          <w:rFonts w:ascii="Times New Roman" w:eastAsia="Times New Roman" w:hAnsi="Times New Roman" w:cs="Times New Roman"/>
+          <w:kern w:val="0"/>
+          <w:sz w:val="24"/>
+          <w:szCs w:val="24"/>
+          <w:lang w:eastAsia="en-IN"/>
+          <w14:ligatures w14:val="none"/>
+        </w:rPr>
+      </w:pPr>
+      <w:r>
+        <w:rPr>
+          <w:rFonts w:ascii="Times New Roman" w:eastAsia="Times New Roman" w:hAnsi="Times New Roman" w:cs="Times New Roman"/>
+          <w:kern w:val="0"/>
+          <w:sz w:val="24"/>
+          <w:szCs w:val="24"/>
+          <w:lang w:eastAsia="en-IN"/>
+          <w14:ligatures w14:val="none"/>
+        </w:rPr>
+        <w:t>Verify that the service reaches the database layer.</w:t>
+      </w:r>
+    </w:p>
+    <w:p>
+      <w:pPr>
+        <w:numPr>
+          <w:ilvl w:val="0"/>
+          <w:numId w:val="20"/>
+        </w:numPr>
+        <w:spacing w:before="100" w:beforeAutospacing="1" w:after="100" w:afterAutospacing="1" w:line="240" w:lineRule="auto"/>
+        <w:rPr>
+          <w:rFonts w:ascii="Times New Roman" w:eastAsia="Times New Roman" w:hAnsi="Times New Roman" w:cs="Times New Roman"/>
+          <w:kern w:val="0"/>
+          <w:sz w:val="24"/>
+          <w:szCs w:val="24"/>
+          <w:lang w:eastAsia="en-IN"/>
+          <w14:ligatures w14:val="none"/>
+        </w:rPr>
+      </w:pPr>
+      <w:r>
+        <w:rPr>
+          <w:rFonts w:ascii="Times New Roman" w:eastAsia="Times New Roman" w:hAnsi="Times New Roman" w:cs="Times New Roman"/>
+          <w:kern w:val="0"/>
+          <w:sz w:val="24"/>
+          <w:szCs w:val="24"/>
+          <w:lang w:eastAsia="en-IN"/>
+          <w14:ligatures w14:val="none"/>
+        </w:rPr>
+        <w:t>Check that the database operation succeeds.</w:t>
+      </w:r>
+    </w:p>
+    <w:p>
+      <w:pPr>
+        <w:numPr>
+          <w:ilvl w:val="0"/>
+          <w:numId w:val="20"/>
+        </w:numPr>
+        <w:spacing w:before="100" w:beforeAutospacing="1" w:after="100" w:afterAutospacing="1" w:line="240" w:lineRule="auto"/>
+        <w:rPr>
+          <w:rFonts w:ascii="Times New Roman" w:eastAsia="Times New Roman" w:hAnsi="Times New Roman" w:cs="Times New Roman"/>
+          <w:kern w:val="0"/>
+          <w:sz w:val="24"/>
+          <w:szCs w:val="24"/>
+          <w:lang w:eastAsia="en-IN"/>
+          <w14:ligatures w14:val="none"/>
+        </w:rPr>
+      </w:pPr>
+      <w:r>
+        <w:rPr>
+          <w:rFonts w:ascii="Times New Roman" w:eastAsia="Times New Roman" w:hAnsi="Times New Roman" w:cs="Times New Roman"/>
+          <w:kern w:val="0"/>
+          <w:sz w:val="24"/>
+          <w:szCs w:val="24"/>
+          <w:lang w:eastAsia="en-IN"/>
+          <w14:ligatures w14:val="none"/>
+        </w:rPr>
+        <w:t>Assert that the data is persisted correctly.</w:t>
+      </w:r>
+    </w:p>
+    <w:p>
+      <w:pPr>
+        <w:spacing w:before="100" w:beforeAutospacing="1" w:after="100" w:afterAutospacing="1" w:line="240" w:lineRule="auto"/>
+        <w:rPr>
+          <w:rFonts w:ascii="Times New Roman" w:eastAsia="Times New Roman" w:hAnsi="Times New Roman" w:cs="Times New Roman"/>
+          <w:kern w:val="0"/>
+          <w:sz w:val="24"/>
+          <w:szCs w:val="24"/>
+          <w:lang w:eastAsia="en-IN"/>
+          <w14:ligatures w14:val="none"/>
+        </w:rPr>
+      </w:pPr>
+      <w:r>
+        <w:rPr>
+          <w:rFonts w:ascii="Times New Roman" w:eastAsia="Times New Roman" w:hAnsi="Times New Roman" w:cs="Times New Roman"/>
+          <w:kern w:val="0"/>
+          <w:sz w:val="24"/>
+          <w:szCs w:val="24"/>
+          <w:lang w:eastAsia="en-IN"/>
+          <w14:ligatures w14:val="none"/>
+        </w:rPr>
+        <w:t>Example 2: Kafka integration</w:t>
+      </w:r>
+    </w:p>
+    <w:p>
+      <w:pPr>
+        <w:tabs>
+          <w:tab w:val="left" w:pos="916"/>
+          <w:tab w:val="left" w:pos="1832"/>
+          <w:tab w:val="left" w:pos="2748"/>
+          <w:tab w:val="left" w:pos="3664"/>
+          <w:tab w:val="left" w:pos="4580"/>
+          <w:tab w:val="left" w:pos="5496"/>
+          <w:tab w:val="left" w:pos="6412"/>
+          <w:tab w:val="left" w:pos="7328"/>
+          <w:tab w:val="left" w:pos="8244"/>
+          <w:tab w:val="left" w:pos="9160"/>
+          <w:tab w:val="left" w:pos="10076"/>
+          <w:tab w:val="left" w:pos="10992"/>
+          <w:tab w:val="left" w:pos="11908"/>
+          <w:tab w:val="left" w:pos="12824"/>
+          <w:tab w:val="left" w:pos="13740"/>
+          <w:tab w:val="left" w:pos="14656"/>
+        </w:tabs>
+        <w:spacing w:after="0" w:line="240" w:lineRule="auto"/>
+        <w:rPr>
+          <w:rFonts w:ascii="Courier New" w:eastAsia="Times New Roman" w:hAnsi="Courier New" w:cs="Courier New"/>
+          <w:kern w:val="0"/>
+          <w:sz w:val="20"/>
+          <w:szCs w:val="20"/>
+          <w:lang w:eastAsia="en-IN"/>
+          <w14:ligatures w14:val="none"/>
+        </w:rPr>
+      </w:pPr>
+      <w:r>
+        <w:rPr>
+          <w:rFonts w:ascii="Courier New" w:eastAsia="Times New Roman" w:hAnsi="Courier New" w:cs="Courier New"/>
+          <w:kern w:val="0"/>
+          <w:sz w:val="20"/>
+          <w:szCs w:val="20"/>
+          <w:lang w:eastAsia="en-IN"/>
+          <w14:ligatures w14:val="none"/>
+        </w:rPr>
+        <w:t>Service A → Publish message → Kafka Topic</w:t>
+      </w:r>
+    </w:p>
+    <w:p>
+      <w:pPr>
+        <w:tabs>
+          <w:tab w:val="left" w:pos="916"/>
+          <w:tab w:val="left" w:pos="1832"/>
+          <w:tab w:val="left" w:pos="2748"/>
+          <w:tab w:val="left" w:pos="3664"/>
+          <w:tab w:val="left" w:pos="4580"/>
+          <w:tab w:val="left" w:pos="5496"/>
+          <w:tab w:val="left" w:pos="6412"/>
+          <w:tab w:val="left" w:pos="7328"/>
+          <w:tab w:val="left" w:pos="8244"/>
+          <w:tab w:val="left" w:pos="9160"/>
+          <w:tab w:val="left" w:pos="10076"/>
+          <w:tab w:val="left" w:pos="10992"/>
+          <w:tab w:val="left" w:pos="11908"/>
+          <w:tab w:val="left" w:pos="12824"/>
+          <w:tab w:val="left" w:pos="13740"/>
+          <w:tab w:val="left" w:pos="14656"/>
+        </w:tabs>
+        <w:spacing w:after="0" w:line="240" w:lineRule="auto"/>
+        <w:rPr>
+          <w:rFonts w:ascii="Courier New" w:eastAsia="Times New Roman" w:hAnsi="Courier New" w:cs="Courier New"/>
+          <w:kern w:val="0"/>
+          <w:sz w:val="20"/>
+          <w:szCs w:val="20"/>
+          <w:lang w:eastAsia="en-IN"/>
+          <w14:ligatures w14:val="none"/>
+        </w:rPr>
+      </w:pPr>
+      <w:r>
+        <w:rPr>
+          <w:rFonts w:ascii="Courier New" w:eastAsia="Times New Roman" w:hAnsi="Courier New" w:cs="Courier New"/>
+          <w:kern w:val="0"/>
+          <w:sz w:val="20"/>
+          <w:szCs w:val="20"/>
+          <w:lang w:eastAsia="en-IN"/>
+          <w14:ligatures w14:val="none"/>
+        </w:rPr>
+        <w:t xml:space="preserve">                              ↓</w:t>
+      </w:r>
+    </w:p>
+    <w:p>
+      <w:pPr>
+        <w:tabs>
+          <w:tab w:val="left" w:pos="916"/>
+          <w:tab w:val="left" w:pos="1832"/>
+          <w:tab w:val="left" w:pos="2748"/>
+          <w:tab w:val="left" w:pos="3664"/>
+          <w:tab w:val="left" w:pos="4580"/>
+          <w:tab w:val="left" w:pos="5496"/>
+          <w:tab w:val="left" w:pos="6412"/>
+          <w:tab w:val="left" w:pos="7328"/>
+          <w:tab w:val="left" w:pos="8244"/>
+          <w:tab w:val="left" w:pos="9160"/>
+          <w:tab w:val="left" w:pos="10076"/>
+          <w:tab w:val="left" w:pos="10992"/>
+          <w:tab w:val="left" w:pos="11908"/>
+          <w:tab w:val="left" w:pos="12824"/>
+          <w:tab w:val="left" w:pos="13740"/>
+          <w:tab w:val="left" w:pos="14656"/>
+        </w:tabs>
+        <w:spacing w:after="0" w:line="240" w:lineRule="auto"/>
+        <w:rPr>
+          <w:rFonts w:ascii="Courier New" w:eastAsia="Times New Roman" w:hAnsi="Courier New" w:cs="Courier New"/>
+          <w:kern w:val="0"/>
+          <w:sz w:val="20"/>
+          <w:szCs w:val="20"/>
+          <w:lang w:eastAsia="en-IN"/>
+          <w14:ligatures w14:val="none"/>
+        </w:rPr>
+      </w:pPr>
+      <w:r>
+        <w:rPr>
+          <w:rFonts w:ascii="Courier New" w:eastAsia="Times New Roman" w:hAnsi="Courier New" w:cs="Courier New"/>
+          <w:kern w:val="0"/>
+          <w:sz w:val="20"/>
+          <w:szCs w:val="20"/>
+          <w:lang w:eastAsia="en-IN"/>
+          <w14:ligatures w14:val="none"/>
+        </w:rPr>
+        <w:t xml:space="preserve">                    Verify message received</w:t>
+      </w:r>
+    </w:p>
+    <w:p>
+      <w:pPr>
+        <w:spacing w:before="100" w:beforeAutospacing="1" w:after="100" w:afterAutospacing="1" w:line="240" w:lineRule="auto"/>
+        <w:rPr>
+          <w:rFonts w:ascii="Times New Roman" w:eastAsia="Times New Roman" w:hAnsi="Times New Roman" w:cs="Times New Roman"/>
+          <w:kern w:val="0"/>
+          <w:sz w:val="24"/>
+          <w:szCs w:val="24"/>
+          <w:lang w:eastAsia="en-IN"/>
+          <w14:ligatures w14:val="none"/>
+        </w:rPr>
+      </w:pPr>
+      <w:r>
+        <w:rPr>
+          <w:rFonts w:ascii="Times New Roman" w:eastAsia="Times New Roman" w:hAnsi="Times New Roman" w:cs="Times New Roman"/>
+          <w:kern w:val="0"/>
+          <w:sz w:val="24"/>
+          <w:szCs w:val="24"/>
+          <w:lang w:eastAsia="en-IN"/>
+          <w14:ligatures w14:val="none"/>
+        </w:rPr>
+        <w:t>Interview answer: “If Service A publishes a message to Kafka, I verify that the message is successfully published to the expected topic and contains the correct data.”</w:t>
+      </w:r>
+    </w:p>
+    <w:p>
+      <w:pPr>
+        <w:spacing w:before="100" w:beforeAutospacing="1" w:after="100" w:afterAutospacing="1" w:line="240" w:lineRule="auto"/>
+        <w:outlineLvl w:val="1"/>
+        <w:rPr>
+          <w:rFonts w:ascii="Times New Roman" w:eastAsia="Times New Roman" w:hAnsi="Times New Roman" w:cs="Times New Roman"/>
+          <w:b/>
+          <w:bCs/>
+          <w:kern w:val="0"/>
+          <w:sz w:val="36"/>
+          <w:szCs w:val="36"/>
+          <w:lang w:eastAsia="en-IN"/>
+          <w14:ligatures w14:val="none"/>
+        </w:rPr>
+      </w:pPr>
+      <w:r>
+        <w:rPr>
+          <w:rFonts w:ascii="Times New Roman" w:eastAsia="Times New Roman" w:hAnsi="Times New Roman" w:cs="Times New Roman"/>
+          <w:b/>
+          <w:bCs/>
+          <w:kern w:val="0"/>
+          <w:sz w:val="36"/>
+          <w:szCs w:val="36"/>
+          <w:lang w:eastAsia="en-IN"/>
+          <w14:ligatures w14:val="none"/>
+        </w:rPr>
+        <w:t>3. Functional Testing</w:t>
+      </w:r>
+    </w:p>
+    <w:p>
+      <w:pPr>
+        <w:spacing w:before="100" w:beforeAutospacing="1" w:after="100" w:afterAutospacing="1" w:line="240" w:lineRule="auto"/>
+        <w:rPr>
+          <w:rFonts w:ascii="Times New Roman" w:eastAsia="Times New Roman" w:hAnsi="Times New Roman" w:cs="Times New Roman"/>
+          <w:kern w:val="0"/>
+          <w:sz w:val="24"/>
+          <w:szCs w:val="24"/>
+          <w:lang w:eastAsia="en-IN"/>
+          <w14:ligatures w14:val="none"/>
+        </w:rPr>
+      </w:pPr>
+      <w:r>
+        <w:rPr>
+          <w:rFonts w:ascii="Times New Roman" w:eastAsia="Times New Roman" w:hAnsi="Times New Roman" w:cs="Times New Roman"/>
+          <w:kern w:val="0"/>
+          <w:sz w:val="24"/>
+          <w:szCs w:val="24"/>
+          <w:lang w:eastAsia="en-IN"/>
+          <w14:ligatures w14:val="none"/>
+        </w:rPr>
+        <w:t>Interview answer:</w:t>
+      </w:r>
+    </w:p>
+    <w:p>
+      <w:pPr>
+        <w:spacing w:before="100" w:beforeAutospacing="1" w:after="100" w:afterAutospacing="1" w:line="240" w:lineRule="auto"/>
+        <w:rPr>
+          <w:rFonts w:ascii="Times New Roman" w:eastAsia="Times New Roman" w:hAnsi="Times New Roman" w:cs="Times New Roman"/>
+          <w:kern w:val="0"/>
+          <w:sz w:val="24"/>
+          <w:szCs w:val="24"/>
+          <w:lang w:eastAsia="en-IN"/>
+          <w14:ligatures w14:val="none"/>
+        </w:rPr>
+      </w:pPr>
+      <w:r>
+        <w:rPr>
+          <w:rFonts w:ascii="Times New Roman" w:eastAsia="Times New Roman" w:hAnsi="Times New Roman" w:cs="Times New Roman"/>
+          <w:kern w:val="0"/>
+          <w:sz w:val="24"/>
+          <w:szCs w:val="24"/>
+          <w:lang w:eastAsia="en-IN"/>
+          <w14:ligatures w14:val="none"/>
+        </w:rPr>
+        <w:t>“Functional testing verifies whether a feature or business functionality works according to the business requirements and expected behaviour.”</w:t>
+      </w:r>
+    </w:p>
+    <w:p>
+      <w:pPr>
+        <w:spacing w:before="100" w:beforeAutospacing="1" w:after="100" w:afterAutospacing="1" w:line="240" w:lineRule="auto"/>
+        <w:rPr>
+          <w:rFonts w:ascii="Times New Roman" w:eastAsia="Times New Roman" w:hAnsi="Times New Roman" w:cs="Times New Roman"/>
+          <w:kern w:val="0"/>
+          <w:sz w:val="24"/>
+          <w:szCs w:val="24"/>
+          <w:lang w:eastAsia="en-IN"/>
+          <w14:ligatures w14:val="none"/>
+        </w:rPr>
+      </w:pPr>
+      <w:r>
+        <w:rPr>
+          <w:rFonts w:ascii="Times New Roman" w:eastAsia="Times New Roman" w:hAnsi="Times New Roman" w:cs="Times New Roman"/>
+          <w:kern w:val="0"/>
+          <w:sz w:val="24"/>
+          <w:szCs w:val="24"/>
+          <w:lang w:eastAsia="en-IN"/>
+          <w14:ligatures w14:val="none"/>
+        </w:rPr>
+        <w:t>Real-life example: Online shopping</w:t>
+      </w:r>
+    </w:p>
+    <w:p>
+      <w:pPr>
+        <w:tabs>
+          <w:tab w:val="left" w:pos="916"/>
+          <w:tab w:val="left" w:pos="1832"/>
+          <w:tab w:val="left" w:pos="2748"/>
+          <w:tab w:val="left" w:pos="3664"/>
+          <w:tab w:val="left" w:pos="4580"/>
+          <w:tab w:val="left" w:pos="5496"/>
+          <w:tab w:val="left" w:pos="6412"/>
+          <w:tab w:val="left" w:pos="7328"/>
+          <w:tab w:val="left" w:pos="8244"/>
+          <w:tab w:val="left" w:pos="9160"/>
+          <w:tab w:val="left" w:pos="10076"/>
+          <w:tab w:val="left" w:pos="10992"/>
+          <w:tab w:val="left" w:pos="11908"/>
+          <w:tab w:val="left" w:pos="12824"/>
+          <w:tab w:val="left" w:pos="13740"/>
+          <w:tab w:val="left" w:pos="14656"/>
+        </w:tabs>
+        <w:spacing w:after="0" w:line="240" w:lineRule="auto"/>
+        <w:rPr>
+          <w:rFonts w:ascii="Courier New" w:eastAsia="Times New Roman" w:hAnsi="Courier New" w:cs="Courier New"/>
+          <w:kern w:val="0"/>
+          <w:sz w:val="20"/>
+          <w:szCs w:val="20"/>
+          <w:lang w:eastAsia="en-IN"/>
+          <w14:ligatures w14:val="none"/>
+        </w:rPr>
+      </w:pPr>
+      <w:r>
+        <w:rPr>
+          <w:rFonts w:ascii="Courier New" w:eastAsia="Times New Roman" w:hAnsi="Courier New" w:cs="Courier New"/>
+          <w:kern w:val="0"/>
+          <w:sz w:val="20"/>
+          <w:szCs w:val="20"/>
+          <w:lang w:eastAsia="en-IN"/>
+          <w14:ligatures w14:val="none"/>
+        </w:rPr>
+        <w:lastRenderedPageBreak/>
+        <w:t>Customer selects product</w:t>
+      </w:r>
+    </w:p>
+    <w:p>
+      <w:pPr>
+        <w:tabs>
+          <w:tab w:val="left" w:pos="916"/>
+          <w:tab w:val="left" w:pos="1832"/>
+          <w:tab w:val="left" w:pos="2748"/>
+          <w:tab w:val="left" w:pos="3664"/>
+          <w:tab w:val="left" w:pos="4580"/>
+          <w:tab w:val="left" w:pos="5496"/>
+          <w:tab w:val="left" w:pos="6412"/>
+          <w:tab w:val="left" w:pos="7328"/>
+          <w:tab w:val="left" w:pos="8244"/>
+          <w:tab w:val="left" w:pos="9160"/>
+          <w:tab w:val="left" w:pos="10076"/>
+          <w:tab w:val="left" w:pos="10992"/>
+          <w:tab w:val="left" w:pos="11908"/>
+          <w:tab w:val="left" w:pos="12824"/>
+          <w:tab w:val="left" w:pos="13740"/>
+          <w:tab w:val="left" w:pos="14656"/>
+        </w:tabs>
+        <w:spacing w:after="0" w:line="240" w:lineRule="auto"/>
+        <w:rPr>
+          <w:rFonts w:ascii="Courier New" w:eastAsia="Times New Roman" w:hAnsi="Courier New" w:cs="Courier New"/>
+          <w:kern w:val="0"/>
+          <w:sz w:val="20"/>
+          <w:szCs w:val="20"/>
+          <w:lang w:eastAsia="en-IN"/>
+          <w14:ligatures w14:val="none"/>
+        </w:rPr>
+      </w:pPr>
+      <w:r>
+        <w:rPr>
+          <w:rFonts w:ascii="Courier New" w:eastAsia="Times New Roman" w:hAnsi="Courier New" w:cs="Courier New"/>
+          <w:kern w:val="0"/>
+          <w:sz w:val="20"/>
+          <w:szCs w:val="20"/>
+          <w:lang w:eastAsia="en-IN"/>
+          <w14:ligatures w14:val="none"/>
+        </w:rPr>
+        <w:t xml:space="preserve">        ↓</w:t>
+      </w:r>
+    </w:p>
+    <w:p>
+      <w:pPr>
+        <w:tabs>
+          <w:tab w:val="left" w:pos="916"/>
+          <w:tab w:val="left" w:pos="1832"/>
+          <w:tab w:val="left" w:pos="2748"/>
+          <w:tab w:val="left" w:pos="3664"/>
+          <w:tab w:val="left" w:pos="4580"/>
+          <w:tab w:val="left" w:pos="5496"/>
+          <w:tab w:val="left" w:pos="6412"/>
+          <w:tab w:val="left" w:pos="7328"/>
+          <w:tab w:val="left" w:pos="8244"/>
+          <w:tab w:val="left" w:pos="9160"/>
+          <w:tab w:val="left" w:pos="10076"/>
+          <w:tab w:val="left" w:pos="10992"/>
+          <w:tab w:val="left" w:pos="11908"/>
+          <w:tab w:val="left" w:pos="12824"/>
+          <w:tab w:val="left" w:pos="13740"/>
+          <w:tab w:val="left" w:pos="14656"/>
+        </w:tabs>
+        <w:spacing w:after="0" w:line="240" w:lineRule="auto"/>
+        <w:rPr>
+          <w:rFonts w:ascii="Courier New" w:eastAsia="Times New Roman" w:hAnsi="Courier New" w:cs="Courier New"/>
+          <w:kern w:val="0"/>
+          <w:sz w:val="20"/>
+          <w:szCs w:val="20"/>
+          <w:lang w:eastAsia="en-IN"/>
+          <w14:ligatures w14:val="none"/>
+        </w:rPr>
+      </w:pPr>
+      <w:r>
+        <w:rPr>
+          <w:rFonts w:ascii="Courier New" w:eastAsia="Times New Roman" w:hAnsi="Courier New" w:cs="Courier New"/>
+          <w:kern w:val="0"/>
+          <w:sz w:val="20"/>
+          <w:szCs w:val="20"/>
+          <w:lang w:eastAsia="en-IN"/>
+          <w14:ligatures w14:val="none"/>
+        </w:rPr>
+        <w:t>Adds product to cart</w:t>
+      </w:r>
+    </w:p>
+    <w:p>
+      <w:pPr>
+        <w:tabs>
+          <w:tab w:val="left" w:pos="916"/>
+          <w:tab w:val="left" w:pos="1832"/>
+          <w:tab w:val="left" w:pos="2748"/>
+          <w:tab w:val="left" w:pos="3664"/>
+          <w:tab w:val="left" w:pos="4580"/>
+          <w:tab w:val="left" w:pos="5496"/>
+          <w:tab w:val="left" w:pos="6412"/>
+          <w:tab w:val="left" w:pos="7328"/>
+          <w:tab w:val="left" w:pos="8244"/>
+          <w:tab w:val="left" w:pos="9160"/>
+          <w:tab w:val="left" w:pos="10076"/>
+          <w:tab w:val="left" w:pos="10992"/>
+          <w:tab w:val="left" w:pos="11908"/>
+          <w:tab w:val="left" w:pos="12824"/>
+          <w:tab w:val="left" w:pos="13740"/>
+          <w:tab w:val="left" w:pos="14656"/>
+        </w:tabs>
+        <w:spacing w:after="0" w:line="240" w:lineRule="auto"/>
+        <w:rPr>
+          <w:rFonts w:ascii="Courier New" w:eastAsia="Times New Roman" w:hAnsi="Courier New" w:cs="Courier New"/>
+          <w:kern w:val="0"/>
+          <w:sz w:val="20"/>
+          <w:szCs w:val="20"/>
+          <w:lang w:eastAsia="en-IN"/>
+          <w14:ligatures w14:val="none"/>
+        </w:rPr>
+      </w:pPr>
+      <w:r>
+        <w:rPr>
+          <w:rFonts w:ascii="Courier New" w:eastAsia="Times New Roman" w:hAnsi="Courier New" w:cs="Courier New"/>
+          <w:kern w:val="0"/>
+          <w:sz w:val="20"/>
+          <w:szCs w:val="20"/>
+          <w:lang w:eastAsia="en-IN"/>
+          <w14:ligatures w14:val="none"/>
+        </w:rPr>
+        <w:t xml:space="preserve">        ↓</w:t>
+      </w:r>
+    </w:p>
+    <w:p>
+      <w:pPr>
+        <w:tabs>
+          <w:tab w:val="left" w:pos="916"/>
+          <w:tab w:val="left" w:pos="1832"/>
+          <w:tab w:val="left" w:pos="2748"/>
+          <w:tab w:val="left" w:pos="3664"/>
+          <w:tab w:val="left" w:pos="4580"/>
+          <w:tab w:val="left" w:pos="5496"/>
+          <w:tab w:val="left" w:pos="6412"/>
+          <w:tab w:val="left" w:pos="7328"/>
+          <w:tab w:val="left" w:pos="8244"/>
+          <w:tab w:val="left" w:pos="9160"/>
+          <w:tab w:val="left" w:pos="10076"/>
+          <w:tab w:val="left" w:pos="10992"/>
+          <w:tab w:val="left" w:pos="11908"/>
+          <w:tab w:val="left" w:pos="12824"/>
+          <w:tab w:val="left" w:pos="13740"/>
+          <w:tab w:val="left" w:pos="14656"/>
+        </w:tabs>
+        <w:spacing w:after="0" w:line="240" w:lineRule="auto"/>
+        <w:rPr>
+          <w:rFonts w:ascii="Courier New" w:eastAsia="Times New Roman" w:hAnsi="Courier New" w:cs="Courier New"/>
+          <w:kern w:val="0"/>
+          <w:sz w:val="20"/>
+          <w:szCs w:val="20"/>
+          <w:lang w:eastAsia="en-IN"/>
+          <w14:ligatures w14:val="none"/>
+        </w:rPr>
+      </w:pPr>
+      <w:r>
+        <w:rPr>
+          <w:rFonts w:ascii="Courier New" w:eastAsia="Times New Roman" w:hAnsi="Courier New" w:cs="Courier New"/>
+          <w:kern w:val="0"/>
+          <w:sz w:val="20"/>
+          <w:szCs w:val="20"/>
+          <w:lang w:eastAsia="en-IN"/>
+          <w14:ligatures w14:val="none"/>
+        </w:rPr>
+        <w:t>Completes checkout</w:t>
+      </w:r>
+    </w:p>
+    <w:p>
+      <w:pPr>
+        <w:tabs>
+          <w:tab w:val="left" w:pos="916"/>
+          <w:tab w:val="left" w:pos="1832"/>
+          <w:tab w:val="left" w:pos="2748"/>
+          <w:tab w:val="left" w:pos="3664"/>
+          <w:tab w:val="left" w:pos="4580"/>
+          <w:tab w:val="left" w:pos="5496"/>
+          <w:tab w:val="left" w:pos="6412"/>
+          <w:tab w:val="left" w:pos="7328"/>
+          <w:tab w:val="left" w:pos="8244"/>
+          <w:tab w:val="left" w:pos="9160"/>
+          <w:tab w:val="left" w:pos="10076"/>
+          <w:tab w:val="left" w:pos="10992"/>
+          <w:tab w:val="left" w:pos="11908"/>
+          <w:tab w:val="left" w:pos="12824"/>
+          <w:tab w:val="left" w:pos="13740"/>
+          <w:tab w:val="left" w:pos="14656"/>
+        </w:tabs>
+        <w:spacing w:after="0" w:line="240" w:lineRule="auto"/>
+        <w:rPr>
+          <w:rFonts w:ascii="Courier New" w:eastAsia="Times New Roman" w:hAnsi="Courier New" w:cs="Courier New"/>
+          <w:kern w:val="0"/>
+          <w:sz w:val="20"/>
+          <w:szCs w:val="20"/>
+          <w:lang w:eastAsia="en-IN"/>
+          <w14:ligatures w14:val="none"/>
+        </w:rPr>
+      </w:pPr>
+      <w:r>
+        <w:rPr>
+          <w:rFonts w:ascii="Courier New" w:eastAsia="Times New Roman" w:hAnsi="Courier New" w:cs="Courier New"/>
+          <w:kern w:val="0"/>
+          <w:sz w:val="20"/>
+          <w:szCs w:val="20"/>
+          <w:lang w:eastAsia="en-IN"/>
+          <w14:ligatures w14:val="none"/>
+        </w:rPr>
+        <w:t xml:space="preserve">        ↓</w:t>
+      </w:r>
+    </w:p>
+    <w:p>
+      <w:pPr>
+        <w:tabs>
+          <w:tab w:val="left" w:pos="916"/>
+          <w:tab w:val="left" w:pos="1832"/>
+          <w:tab w:val="left" w:pos="2748"/>
+          <w:tab w:val="left" w:pos="3664"/>
+          <w:tab w:val="left" w:pos="4580"/>
+          <w:tab w:val="left" w:pos="5496"/>
+          <w:tab w:val="left" w:pos="6412"/>
+          <w:tab w:val="left" w:pos="7328"/>
+          <w:tab w:val="left" w:pos="8244"/>
+          <w:tab w:val="left" w:pos="9160"/>
+          <w:tab w:val="left" w:pos="10076"/>
+          <w:tab w:val="left" w:pos="10992"/>
+          <w:tab w:val="left" w:pos="11908"/>
+          <w:tab w:val="left" w:pos="12824"/>
+          <w:tab w:val="left" w:pos="13740"/>
+          <w:tab w:val="left" w:pos="14656"/>
+        </w:tabs>
+        <w:spacing w:after="0" w:line="240" w:lineRule="auto"/>
+        <w:rPr>
+          <w:rFonts w:ascii="Courier New" w:eastAsia="Times New Roman" w:hAnsi="Courier New" w:cs="Courier New"/>
+          <w:kern w:val="0"/>
+          <w:sz w:val="20"/>
+          <w:szCs w:val="20"/>
+          <w:lang w:eastAsia="en-IN"/>
+          <w14:ligatures w14:val="none"/>
+        </w:rPr>
+      </w:pPr>
+      <w:r>
+        <w:rPr>
+          <w:rFonts w:ascii="Courier New" w:eastAsia="Times New Roman" w:hAnsi="Courier New" w:cs="Courier New"/>
+          <w:kern w:val="0"/>
+          <w:sz w:val="20"/>
+          <w:szCs w:val="20"/>
+          <w:lang w:eastAsia="en-IN"/>
+          <w14:ligatures w14:val="none"/>
+        </w:rPr>
+        <w:t>Order is successfully placed</w:t>
+      </w:r>
+    </w:p>
+    <w:p>
+      <w:pPr>
+        <w:spacing w:before="100" w:beforeAutospacing="1" w:after="100" w:afterAutospacing="1" w:line="240" w:lineRule="auto"/>
+        <w:rPr>
+          <w:rFonts w:ascii="Times New Roman" w:eastAsia="Times New Roman" w:hAnsi="Times New Roman" w:cs="Times New Roman"/>
+          <w:kern w:val="0"/>
+          <w:sz w:val="24"/>
+          <w:szCs w:val="24"/>
+          <w:lang w:eastAsia="en-IN"/>
+          <w14:ligatures w14:val="none"/>
+        </w:rPr>
+      </w:pPr>
+      <w:r>
+        <w:rPr>
+          <w:rFonts w:ascii="Times New Roman" w:eastAsia="Times New Roman" w:hAnsi="Times New Roman" w:cs="Times New Roman"/>
+          <w:kern w:val="0"/>
+          <w:sz w:val="24"/>
+          <w:szCs w:val="24"/>
+          <w:lang w:eastAsia="en-IN"/>
+          <w14:ligatures w14:val="none"/>
+        </w:rPr>
+        <w:t>We verify that the complete feature behaves as expected from the user's or business's perspective.</w:t>
+      </w:r>
+    </w:p>
+    <w:p>
+      <w:pPr>
+        <w:spacing w:before="100" w:beforeAutospacing="1" w:after="100" w:afterAutospacing="1" w:line="240" w:lineRule="auto"/>
+        <w:outlineLvl w:val="1"/>
+        <w:rPr>
+          <w:rFonts w:ascii="Times New Roman" w:eastAsia="Times New Roman" w:hAnsi="Times New Roman" w:cs="Times New Roman"/>
+          <w:b/>
+          <w:bCs/>
+          <w:kern w:val="0"/>
+          <w:sz w:val="36"/>
+          <w:szCs w:val="36"/>
+          <w:lang w:eastAsia="en-IN"/>
+          <w14:ligatures w14:val="none"/>
+        </w:rPr>
+      </w:pPr>
+      <w:r>
+        <w:rPr>
+          <w:rFonts w:ascii="Times New Roman" w:eastAsia="Times New Roman" w:hAnsi="Times New Roman" w:cs="Times New Roman"/>
+          <w:b/>
+          <w:bCs/>
+          <w:kern w:val="0"/>
+          <w:sz w:val="36"/>
+          <w:szCs w:val="36"/>
+          <w:lang w:eastAsia="en-IN"/>
+          <w14:ligatures w14:val="none"/>
+        </w:rPr>
+        <w:t>Difference to Remember</w:t>
+      </w:r>
+    </w:p>
+    <w:tbl>
+      <w:tblPr>
+        <w:tblW w:w="0" w:type="auto"/>
+        <w:tblCellSpacing w:w="15" w:type="dxa"/>
+        <w:tblCellMar>
+          <w:top w:w="15" w:type="dxa"/>
+          <w:left w:w="15" w:type="dxa"/>
+          <w:bottom w:w="15" w:type="dxa"/>
+          <w:right w:w="15" w:type="dxa"/>
+        </w:tblCellMar>
+        <w:tblLook w:val="04A0" w:firstRow="1" w:lastRow="0" w:firstColumn="1" w:lastColumn="0" w:noHBand="0" w:noVBand="1"/>
+      </w:tblPr>
+      <w:tblGrid>
+        <w:gridCol w:w="5693"/>
+        <w:gridCol w:w="4773"/>
+      </w:tblGrid>
+      <w:tr>
+        <w:trPr>
+          <w:tblCellSpacing w:w="15" w:type="dxa"/>
+        </w:trPr>
+        <w:tc>
+          <w:tcPr>
+            <w:tcW w:w="0" w:type="auto"/>
+            <w:vAlign w:val="center"/>
+            <w:hideMark/>
+          </w:tcPr>
+          <w:p>
+            <w:pPr>
+              <w:spacing w:before="100" w:beforeAutospacing="1" w:after="100" w:afterAutospacing="1" w:line="240" w:lineRule="auto"/>
+              <w:jc w:val="center"/>
+              <w:rPr>
+                <w:rFonts w:ascii="Times New Roman" w:eastAsia="Times New Roman" w:hAnsi="Times New Roman" w:cs="Times New Roman"/>
+                <w:b/>
+                <w:bCs/>
+                <w:kern w:val="0"/>
+                <w:sz w:val="24"/>
+                <w:szCs w:val="24"/>
+                <w:lang w:eastAsia="en-IN"/>
+                <w14:ligatures w14:val="none"/>
+              </w:rPr>
+            </w:pPr>
+            <w:r>
+              <w:rPr>
+                <w:rFonts w:ascii="Times New Roman" w:eastAsia="Times New Roman" w:hAnsi="Times New Roman" w:cs="Times New Roman"/>
+                <w:b/>
+                <w:bCs/>
+                <w:kern w:val="0"/>
+                <w:sz w:val="24"/>
+                <w:szCs w:val="24"/>
+                <w:lang w:eastAsia="en-IN"/>
+                <w14:ligatures w14:val="none"/>
+              </w:rPr>
+              <w:t>Integration testing</w:t>
+            </w:r>
+          </w:p>
+        </w:tc>
+        <w:tc>
+          <w:tcPr>
+            <w:tcW w:w="0" w:type="auto"/>
+            <w:vAlign w:val="center"/>
+            <w:hideMark/>
+          </w:tcPr>
+          <w:p>
+            <w:pPr>
+              <w:spacing w:before="100" w:beforeAutospacing="1" w:after="100" w:afterAutospacing="1" w:line="240" w:lineRule="auto"/>
+              <w:jc w:val="center"/>
+              <w:rPr>
+                <w:rFonts w:ascii="Times New Roman" w:eastAsia="Times New Roman" w:hAnsi="Times New Roman" w:cs="Times New Roman"/>
+                <w:b/>
+                <w:bCs/>
+                <w:kern w:val="0"/>
+                <w:sz w:val="24"/>
+                <w:szCs w:val="24"/>
+                <w:lang w:eastAsia="en-IN"/>
+                <w14:ligatures w14:val="none"/>
+              </w:rPr>
+            </w:pPr>
+            <w:r>
+              <w:rPr>
+                <w:rFonts w:ascii="Times New Roman" w:eastAsia="Times New Roman" w:hAnsi="Times New Roman" w:cs="Times New Roman"/>
+                <w:b/>
+                <w:bCs/>
+                <w:kern w:val="0"/>
+                <w:sz w:val="24"/>
+                <w:szCs w:val="24"/>
+                <w:lang w:eastAsia="en-IN"/>
+                <w14:ligatures w14:val="none"/>
+              </w:rPr>
+              <w:t>Functional testing</w:t>
+            </w:r>
+          </w:p>
+        </w:tc>
+      </w:tr>
+      <w:tr>
+        <w:trPr>
+          <w:tblCellSpacing w:w="15" w:type="dxa"/>
+        </w:trPr>
+        <w:tc>
+          <w:tcPr>
+            <w:tcW w:w="0" w:type="auto"/>
+            <w:vAlign w:val="center"/>
+            <w:hideMark/>
+          </w:tcPr>
+          <w:p>
+            <w:pPr>
+              <w:spacing w:before="100" w:beforeAutospacing="1" w:after="100" w:afterAutospacing="1" w:line="240" w:lineRule="auto"/>
+              <w:rPr>
+                <w:rFonts w:ascii="Times New Roman" w:eastAsia="Times New Roman" w:hAnsi="Times New Roman" w:cs="Times New Roman"/>
+                <w:kern w:val="0"/>
+                <w:sz w:val="24"/>
+                <w:szCs w:val="24"/>
+                <w:lang w:eastAsia="en-IN"/>
+                <w14:ligatures w14:val="none"/>
+              </w:rPr>
+            </w:pPr>
+            <w:r>
+              <w:rPr>
+                <w:rFonts w:ascii="Times New Roman" w:eastAsia="Times New Roman" w:hAnsi="Times New Roman" w:cs="Times New Roman"/>
+                <w:kern w:val="0"/>
+                <w:sz w:val="24"/>
+                <w:szCs w:val="24"/>
+                <w:lang w:eastAsia="en-IN"/>
+                <w14:ligatures w14:val="none"/>
+              </w:rPr>
+              <w:t>Checks whether components work together.</w:t>
+            </w:r>
+          </w:p>
+        </w:tc>
+        <w:tc>
+          <w:tcPr>
+            <w:tcW w:w="0" w:type="auto"/>
+            <w:vAlign w:val="center"/>
+            <w:hideMark/>
+          </w:tcPr>
+          <w:p>
+            <w:pPr>
+              <w:spacing w:before="100" w:beforeAutospacing="1" w:after="100" w:afterAutospacing="1" w:line="240" w:lineRule="auto"/>
+              <w:rPr>
+                <w:rFonts w:ascii="Times New Roman" w:eastAsia="Times New Roman" w:hAnsi="Times New Roman" w:cs="Times New Roman"/>
+                <w:kern w:val="0"/>
+                <w:sz w:val="24"/>
+                <w:szCs w:val="24"/>
+                <w:lang w:eastAsia="en-IN"/>
+                <w14:ligatures w14:val="none"/>
+              </w:rPr>
+            </w:pPr>
+            <w:r>
+              <w:rPr>
+                <w:rFonts w:ascii="Times New Roman" w:eastAsia="Times New Roman" w:hAnsi="Times New Roman" w:cs="Times New Roman"/>
+                <w:kern w:val="0"/>
+                <w:sz w:val="24"/>
+                <w:szCs w:val="24"/>
+                <w:lang w:eastAsia="en-IN"/>
+                <w14:ligatures w14:val="none"/>
+              </w:rPr>
+              <w:t>Checks whether the feature meets requirements.</w:t>
+            </w:r>
+          </w:p>
+        </w:tc>
+      </w:tr>
+      <w:tr>
+        <w:trPr>
+          <w:tblCellSpacing w:w="15" w:type="dxa"/>
+        </w:trPr>
+        <w:tc>
+          <w:tcPr>
+            <w:tcW w:w="0" w:type="auto"/>
+            <w:vAlign w:val="center"/>
+            <w:hideMark/>
+          </w:tcPr>
+          <w:p>
+            <w:pPr>
+              <w:spacing w:before="100" w:beforeAutospacing="1" w:after="100" w:afterAutospacing="1" w:line="240" w:lineRule="auto"/>
+              <w:rPr>
+                <w:rFonts w:ascii="Times New Roman" w:eastAsia="Times New Roman" w:hAnsi="Times New Roman" w:cs="Times New Roman"/>
+                <w:kern w:val="0"/>
+                <w:sz w:val="24"/>
+                <w:szCs w:val="24"/>
+                <w:lang w:eastAsia="en-IN"/>
+                <w14:ligatures w14:val="none"/>
+              </w:rPr>
+            </w:pPr>
+            <w:r>
+              <w:rPr>
+                <w:rFonts w:ascii="Times New Roman" w:eastAsia="Times New Roman" w:hAnsi="Times New Roman" w:cs="Times New Roman"/>
+                <w:kern w:val="0"/>
+                <w:sz w:val="24"/>
+                <w:szCs w:val="24"/>
+                <w:lang w:eastAsia="en-IN"/>
+                <w14:ligatures w14:val="none"/>
+              </w:rPr>
+              <w:t>Example: Service successfully publishes a Kafka message.</w:t>
+            </w:r>
+          </w:p>
+        </w:tc>
+        <w:tc>
+          <w:tcPr>
+            <w:tcW w:w="0" w:type="auto"/>
+            <w:vAlign w:val="center"/>
+            <w:hideMark/>
+          </w:tcPr>
+          <w:p>
+            <w:pPr>
+              <w:spacing w:before="100" w:beforeAutospacing="1" w:after="100" w:afterAutospacing="1" w:line="240" w:lineRule="auto"/>
+              <w:rPr>
+                <w:rFonts w:ascii="Times New Roman" w:eastAsia="Times New Roman" w:hAnsi="Times New Roman" w:cs="Times New Roman"/>
+                <w:kern w:val="0"/>
+                <w:sz w:val="24"/>
+                <w:szCs w:val="24"/>
+                <w:lang w:eastAsia="en-IN"/>
+                <w14:ligatures w14:val="none"/>
+              </w:rPr>
+            </w:pPr>
+            <w:r>
+              <w:rPr>
+                <w:rFonts w:ascii="Times New Roman" w:eastAsia="Times New Roman" w:hAnsi="Times New Roman" w:cs="Times New Roman"/>
+                <w:kern w:val="0"/>
+                <w:sz w:val="24"/>
+                <w:szCs w:val="24"/>
+                <w:lang w:eastAsia="en-IN"/>
+                <w14:ligatures w14:val="none"/>
+              </w:rPr>
+              <w:t>Example: Customer successfully places an order.</w:t>
+            </w:r>
+          </w:p>
+        </w:tc>
+      </w:tr>
+      <w:tr>
+        <w:trPr>
+          <w:tblCellSpacing w:w="15" w:type="dxa"/>
+        </w:trPr>
+        <w:tc>
+          <w:tcPr>
+            <w:tcW w:w="0" w:type="auto"/>
+            <w:vAlign w:val="center"/>
+            <w:hideMark/>
+          </w:tcPr>
+          <w:p>
+            <w:pPr>
+              <w:spacing w:before="100" w:beforeAutospacing="1" w:after="100" w:afterAutospacing="1" w:line="240" w:lineRule="auto"/>
+              <w:rPr>
+                <w:rFonts w:ascii="Times New Roman" w:eastAsia="Times New Roman" w:hAnsi="Times New Roman" w:cs="Times New Roman"/>
+                <w:kern w:val="0"/>
+                <w:sz w:val="24"/>
+                <w:szCs w:val="24"/>
+                <w:lang w:eastAsia="en-IN"/>
+                <w14:ligatures w14:val="none"/>
+              </w:rPr>
+            </w:pPr>
+            <w:r>
+              <w:rPr>
+                <w:rFonts w:ascii="Times New Roman" w:eastAsia="Times New Roman" w:hAnsi="Times New Roman" w:cs="Times New Roman"/>
+                <w:kern w:val="0"/>
+                <w:sz w:val="24"/>
+                <w:szCs w:val="24"/>
+                <w:lang w:eastAsia="en-IN"/>
+                <w14:ligatures w14:val="none"/>
+              </w:rPr>
+              <w:t>Focuses on interactions and data flow.</w:t>
+            </w:r>
+          </w:p>
+        </w:tc>
+        <w:tc>
+          <w:tcPr>
+            <w:tcW w:w="0" w:type="auto"/>
+            <w:vAlign w:val="center"/>
+            <w:hideMark/>
+          </w:tcPr>
+          <w:p>
+            <w:pPr>
+              <w:spacing w:before="100" w:beforeAutospacing="1" w:after="100" w:afterAutospacing="1" w:line="240" w:lineRule="auto"/>
+              <w:rPr>
+                <w:rFonts w:ascii="Times New Roman" w:eastAsia="Times New Roman" w:hAnsi="Times New Roman" w:cs="Times New Roman"/>
+                <w:kern w:val="0"/>
+                <w:sz w:val="24"/>
+                <w:szCs w:val="24"/>
+                <w:lang w:eastAsia="en-IN"/>
+                <w14:ligatures w14:val="none"/>
+              </w:rPr>
+            </w:pPr>
+            <w:r>
+              <w:rPr>
+                <w:rFonts w:ascii="Times New Roman" w:eastAsia="Times New Roman" w:hAnsi="Times New Roman" w:cs="Times New Roman"/>
+                <w:kern w:val="0"/>
+                <w:sz w:val="24"/>
+                <w:szCs w:val="24"/>
+                <w:lang w:eastAsia="en-IN"/>
+                <w14:ligatures w14:val="none"/>
+              </w:rPr>
+              <w:t>Focuses on expected business behaviour.</w:t>
+            </w:r>
+          </w:p>
+        </w:tc>
+      </w:tr>
+    </w:tbl>
+    <w:p>
+      <w:pPr>
+        <w:spacing w:before="100" w:beforeAutospacing="1" w:after="100" w:afterAutospacing="1" w:line="240" w:lineRule="auto"/>
+        <w:rPr>
+          <w:rFonts w:ascii="Times New Roman" w:eastAsia="Times New Roman" w:hAnsi="Times New Roman" w:cs="Times New Roman"/>
+          <w:kern w:val="0"/>
+          <w:sz w:val="24"/>
+          <w:szCs w:val="24"/>
+          <w:lang w:eastAsia="en-IN"/>
+          <w14:ligatures w14:val="none"/>
+        </w:rPr>
+      </w:pPr>
+      <w:r>
+        <w:rPr>
+          <w:rFonts w:ascii="Times New Roman" w:eastAsia="Times New Roman" w:hAnsi="Times New Roman" w:cs="Times New Roman"/>
+          <w:kern w:val="0"/>
+          <w:sz w:val="24"/>
+          <w:szCs w:val="24"/>
+          <w:lang w:eastAsia="en-IN"/>
+          <w14:ligatures w14:val="none"/>
+        </w:rPr>
+        <w:t>Remember for interviews: Integration testing = Do the components work together? Functional testing = Does the feature do what the business expects?</w:t>
+      </w:r>
+    </w:p>
+    <w:p>
+      <w:pPr>
         <w:rPr>
           <w:sz w:val="36"/>
           <w:szCs w:val="36"/>
@@ -26399,9 +28714,9 @@
     </w:lvl>
   </w:abstractNum>
   <w:abstractNum w:abstractNumId="8" w15:restartNumberingAfterBreak="0">
-    <w:nsid w:val="398A1786"/>
+    <w:nsid w:val="38D346B9"/>
     <w:multiLevelType w:val="multilevel"/>
-    <w:tmpl w:val="2870AF64"/>
+    <w:tmpl w:val="EA14BF0C"/>
     <w:lvl w:ilvl="0">
       <w:start w:val="1"/>
       <w:numFmt w:val="bullet"/>
@@ -26548,9 +28863,9 @@
     </w:lvl>
   </w:abstractNum>
   <w:abstractNum w:abstractNumId="9" w15:restartNumberingAfterBreak="0">
-    <w:nsid w:val="3D3A1387"/>
+    <w:nsid w:val="398A1786"/>
     <w:multiLevelType w:val="multilevel"/>
-    <w:tmpl w:val="AB487E10"/>
+    <w:tmpl w:val="2870AF64"/>
     <w:lvl w:ilvl="0">
       <w:start w:val="1"/>
       <w:numFmt w:val="bullet"/>
@@ -26697,9 +29012,9 @@
     </w:lvl>
   </w:abstractNum>
   <w:abstractNum w:abstractNumId="10" w15:restartNumberingAfterBreak="0">
-    <w:nsid w:val="46712C8A"/>
+    <w:nsid w:val="3D3A1387"/>
     <w:multiLevelType w:val="multilevel"/>
-    <w:tmpl w:val="BD200164"/>
+    <w:tmpl w:val="AB487E10"/>
     <w:lvl w:ilvl="0">
       <w:start w:val="1"/>
       <w:numFmt w:val="bullet"/>
@@ -26846,122 +29161,9 @@
     </w:lvl>
   </w:abstractNum>
   <w:abstractNum w:abstractNumId="11" w15:restartNumberingAfterBreak="0">
-    <w:nsid w:val="4A8F1298"/>
+    <w:nsid w:val="46712C8A"/>
     <w:multiLevelType w:val="multilevel"/>
-    <w:tmpl w:val="F8C41C7E"/>
-    <w:lvl w:ilvl="0">
-      <w:start w:val="1"/>
-      <w:numFmt w:val="decimal"/>
-      <w:lvlText w:val="%1."/>
-      <w:lvlJc w:val="left"/>
-      <w:pPr>
-        <w:tabs>
-          <w:tab w:val="num" w:pos="720"/>
-        </w:tabs>
-        <w:ind w:left="720" w:hanging="360"/>
-      </w:pPr>
-    </w:lvl>
-    <w:lvl w:ilvl="1" w:tentative="1">
-      <w:start w:val="1"/>
-      <w:numFmt w:val="decimal"/>
-      <w:lvlText w:val="%2."/>
-      <w:lvlJc w:val="left"/>
-      <w:pPr>
-        <w:tabs>
-          <w:tab w:val="num" w:pos="1440"/>
-        </w:tabs>
-        <w:ind w:left="1440" w:hanging="360"/>
-      </w:pPr>
-    </w:lvl>
-    <w:lvl w:ilvl="2" w:tentative="1">
-      <w:start w:val="1"/>
-      <w:numFmt w:val="decimal"/>
-      <w:lvlText w:val="%3."/>
-      <w:lvlJc w:val="left"/>
-      <w:pPr>
-        <w:tabs>
-          <w:tab w:val="num" w:pos="2160"/>
-        </w:tabs>
-        <w:ind w:left="2160" w:hanging="360"/>
-      </w:pPr>
-    </w:lvl>
-    <w:lvl w:ilvl="3" w:tentative="1">
-      <w:start w:val="1"/>
-      <w:numFmt w:val="decimal"/>
-      <w:lvlText w:val="%4."/>
-      <w:lvlJc w:val="left"/>
-      <w:pPr>
-        <w:tabs>
-          <w:tab w:val="num" w:pos="2880"/>
-        </w:tabs>
-        <w:ind w:left="2880" w:hanging="360"/>
-      </w:pPr>
-    </w:lvl>
-    <w:lvl w:ilvl="4" w:tentative="1">
-      <w:start w:val="1"/>
-      <w:numFmt w:val="decimal"/>
-      <w:lvlText w:val="%5."/>
-      <w:lvlJc w:val="left"/>
-      <w:pPr>
-        <w:tabs>
-          <w:tab w:val="num" w:pos="3600"/>
-        </w:tabs>
-        <w:ind w:left="3600" w:hanging="360"/>
-      </w:pPr>
-    </w:lvl>
-    <w:lvl w:ilvl="5" w:tentative="1">
-      <w:start w:val="1"/>
-      <w:numFmt w:val="decimal"/>
-      <w:lvlText w:val="%6."/>
-      <w:lvlJc w:val="left"/>
-      <w:pPr>
-        <w:tabs>
-          <w:tab w:val="num" w:pos="4320"/>
-        </w:tabs>
-        <w:ind w:left="4320" w:hanging="360"/>
-      </w:pPr>
-    </w:lvl>
-    <w:lvl w:ilvl="6" w:tentative="1">
-      <w:start w:val="1"/>
-      <w:numFmt w:val="decimal"/>
-      <w:lvlText w:val="%7."/>
-      <w:lvlJc w:val="left"/>
-      <w:pPr>
-        <w:tabs>
-          <w:tab w:val="num" w:pos="5040"/>
-        </w:tabs>
-        <w:ind w:left="5040" w:hanging="360"/>
-      </w:pPr>
-    </w:lvl>
-    <w:lvl w:ilvl="7" w:tentative="1">
-      <w:start w:val="1"/>
-      <w:numFmt w:val="decimal"/>
-      <w:lvlText w:val="%8."/>
-      <w:lvlJc w:val="left"/>
-      <w:pPr>
-        <w:tabs>
-          <w:tab w:val="num" w:pos="5760"/>
-        </w:tabs>
-        <w:ind w:left="5760" w:hanging="360"/>
-      </w:pPr>
-    </w:lvl>
-    <w:lvl w:ilvl="8" w:tentative="1">
-      <w:start w:val="1"/>
-      <w:numFmt w:val="decimal"/>
-      <w:lvlText w:val="%9."/>
-      <w:lvlJc w:val="left"/>
-      <w:pPr>
-        <w:tabs>
-          <w:tab w:val="num" w:pos="6480"/>
-        </w:tabs>
-        <w:ind w:left="6480" w:hanging="360"/>
-      </w:pPr>
-    </w:lvl>
-  </w:abstractNum>
-  <w:abstractNum w:abstractNumId="12" w15:restartNumberingAfterBreak="0">
-    <w:nsid w:val="4ABF570D"/>
-    <w:multiLevelType w:val="multilevel"/>
-    <w:tmpl w:val="C7F6D2A2"/>
+    <w:tmpl w:val="BD200164"/>
     <w:lvl w:ilvl="0">
       <w:start w:val="1"/>
       <w:numFmt w:val="bullet"/>
@@ -27107,10 +29309,123 @@
       </w:rPr>
     </w:lvl>
   </w:abstractNum>
+  <w:abstractNum w:abstractNumId="12" w15:restartNumberingAfterBreak="0">
+    <w:nsid w:val="4A8F1298"/>
+    <w:multiLevelType w:val="multilevel"/>
+    <w:tmpl w:val="F8C41C7E"/>
+    <w:lvl w:ilvl="0">
+      <w:start w:val="1"/>
+      <w:numFmt w:val="decimal"/>
+      <w:lvlText w:val="%1."/>
+      <w:lvlJc w:val="left"/>
+      <w:pPr>
+        <w:tabs>
+          <w:tab w:val="num" w:pos="720"/>
+        </w:tabs>
+        <w:ind w:left="720" w:hanging="360"/>
+      </w:pPr>
+    </w:lvl>
+    <w:lvl w:ilvl="1" w:tentative="1">
+      <w:start w:val="1"/>
+      <w:numFmt w:val="decimal"/>
+      <w:lvlText w:val="%2."/>
+      <w:lvlJc w:val="left"/>
+      <w:pPr>
+        <w:tabs>
+          <w:tab w:val="num" w:pos="1440"/>
+        </w:tabs>
+        <w:ind w:left="1440" w:hanging="360"/>
+      </w:pPr>
+    </w:lvl>
+    <w:lvl w:ilvl="2" w:tentative="1">
+      <w:start w:val="1"/>
+      <w:numFmt w:val="decimal"/>
+      <w:lvlText w:val="%3."/>
+      <w:lvlJc w:val="left"/>
+      <w:pPr>
+        <w:tabs>
+          <w:tab w:val="num" w:pos="2160"/>
+        </w:tabs>
+        <w:ind w:left="2160" w:hanging="360"/>
+      </w:pPr>
+    </w:lvl>
+    <w:lvl w:ilvl="3" w:tentative="1">
+      <w:start w:val="1"/>
+      <w:numFmt w:val="decimal"/>
+      <w:lvlText w:val="%4."/>
+      <w:lvlJc w:val="left"/>
+      <w:pPr>
+        <w:tabs>
+          <w:tab w:val="num" w:pos="2880"/>
+        </w:tabs>
+        <w:ind w:left="2880" w:hanging="360"/>
+      </w:pPr>
+    </w:lvl>
+    <w:lvl w:ilvl="4" w:tentative="1">
+      <w:start w:val="1"/>
+      <w:numFmt w:val="decimal"/>
+      <w:lvlText w:val="%5."/>
+      <w:lvlJc w:val="left"/>
+      <w:pPr>
+        <w:tabs>
+          <w:tab w:val="num" w:pos="3600"/>
+        </w:tabs>
+        <w:ind w:left="3600" w:hanging="360"/>
+      </w:pPr>
+    </w:lvl>
+    <w:lvl w:ilvl="5" w:tentative="1">
+      <w:start w:val="1"/>
+      <w:numFmt w:val="decimal"/>
+      <w:lvlText w:val="%6."/>
+      <w:lvlJc w:val="left"/>
+      <w:pPr>
+        <w:tabs>
+          <w:tab w:val="num" w:pos="4320"/>
+        </w:tabs>
+        <w:ind w:left="4320" w:hanging="360"/>
+      </w:pPr>
+    </w:lvl>
+    <w:lvl w:ilvl="6" w:tentative="1">
+      <w:start w:val="1"/>
+      <w:numFmt w:val="decimal"/>
+      <w:lvlText w:val="%7."/>
+      <w:lvlJc w:val="left"/>
+      <w:pPr>
+        <w:tabs>
+          <w:tab w:val="num" w:pos="5040"/>
+        </w:tabs>
+        <w:ind w:left="5040" w:hanging="360"/>
+      </w:pPr>
+    </w:lvl>
+    <w:lvl w:ilvl="7" w:tentative="1">
+      <w:start w:val="1"/>
+      <w:numFmt w:val="decimal"/>
+      <w:lvlText w:val="%8."/>
+      <w:lvlJc w:val="left"/>
+      <w:pPr>
+        <w:tabs>
+          <w:tab w:val="num" w:pos="5760"/>
+        </w:tabs>
+        <w:ind w:left="5760" w:hanging="360"/>
+      </w:pPr>
+    </w:lvl>
+    <w:lvl w:ilvl="8" w:tentative="1">
+      <w:start w:val="1"/>
+      <w:numFmt w:val="decimal"/>
+      <w:lvlText w:val="%9."/>
+      <w:lvlJc w:val="left"/>
+      <w:pPr>
+        <w:tabs>
+          <w:tab w:val="num" w:pos="6480"/>
+        </w:tabs>
+        <w:ind w:left="6480" w:hanging="360"/>
+      </w:pPr>
+    </w:lvl>
+  </w:abstractNum>
   <w:abstractNum w:abstractNumId="13" w15:restartNumberingAfterBreak="0">
-    <w:nsid w:val="59D21A79"/>
+    <w:nsid w:val="4ABF570D"/>
     <w:multiLevelType w:val="multilevel"/>
-    <w:tmpl w:val="A56A6FDA"/>
+    <w:tmpl w:val="C7F6D2A2"/>
     <w:lvl w:ilvl="0">
       <w:start w:val="1"/>
       <w:numFmt w:val="bullet"/>
@@ -27257,9 +29572,9 @@
     </w:lvl>
   </w:abstractNum>
   <w:abstractNum w:abstractNumId="14" w15:restartNumberingAfterBreak="0">
-    <w:nsid w:val="6007438E"/>
+    <w:nsid w:val="59D21A79"/>
     <w:multiLevelType w:val="multilevel"/>
-    <w:tmpl w:val="B7E69546"/>
+    <w:tmpl w:val="A56A6FDA"/>
     <w:lvl w:ilvl="0">
       <w:start w:val="1"/>
       <w:numFmt w:val="bullet"/>
@@ -27406,9 +29721,9 @@
     </w:lvl>
   </w:abstractNum>
   <w:abstractNum w:abstractNumId="15" w15:restartNumberingAfterBreak="0">
-    <w:nsid w:val="62192BDC"/>
+    <w:nsid w:val="6007438E"/>
     <w:multiLevelType w:val="multilevel"/>
-    <w:tmpl w:val="C236366C"/>
+    <w:tmpl w:val="B7E69546"/>
     <w:lvl w:ilvl="0">
       <w:start w:val="1"/>
       <w:numFmt w:val="bullet"/>
@@ -27555,9 +29870,9 @@
     </w:lvl>
   </w:abstractNum>
   <w:abstractNum w:abstractNumId="16" w15:restartNumberingAfterBreak="0">
-    <w:nsid w:val="64F0284E"/>
+    <w:nsid w:val="62192BDC"/>
     <w:multiLevelType w:val="multilevel"/>
-    <w:tmpl w:val="0A1E9018"/>
+    <w:tmpl w:val="C236366C"/>
     <w:lvl w:ilvl="0">
       <w:start w:val="1"/>
       <w:numFmt w:val="bullet"/>
@@ -27704,9 +30019,9 @@
     </w:lvl>
   </w:abstractNum>
   <w:abstractNum w:abstractNumId="17" w15:restartNumberingAfterBreak="0">
-    <w:nsid w:val="660D5F45"/>
+    <w:nsid w:val="64F0284E"/>
     <w:multiLevelType w:val="multilevel"/>
-    <w:tmpl w:val="591E28F0"/>
+    <w:tmpl w:val="0A1E9018"/>
     <w:lvl w:ilvl="0">
       <w:start w:val="1"/>
       <w:numFmt w:val="bullet"/>
@@ -27853,9 +30168,9 @@
     </w:lvl>
   </w:abstractNum>
   <w:abstractNum w:abstractNumId="18" w15:restartNumberingAfterBreak="0">
-    <w:nsid w:val="72020B97"/>
+    <w:nsid w:val="660D5F45"/>
     <w:multiLevelType w:val="multilevel"/>
-    <w:tmpl w:val="B77A6ED6"/>
+    <w:tmpl w:val="591E28F0"/>
     <w:lvl w:ilvl="0">
       <w:start w:val="1"/>
       <w:numFmt w:val="bullet"/>
@@ -28001,29 +30316,178 @@
       </w:rPr>
     </w:lvl>
   </w:abstractNum>
+  <w:abstractNum w:abstractNumId="19" w15:restartNumberingAfterBreak="0">
+    <w:nsid w:val="72020B97"/>
+    <w:multiLevelType w:val="multilevel"/>
+    <w:tmpl w:val="B77A6ED6"/>
+    <w:lvl w:ilvl="0">
+      <w:start w:val="1"/>
+      <w:numFmt w:val="bullet"/>
+      <w:lvlText w:val=""/>
+      <w:lvlJc w:val="left"/>
+      <w:pPr>
+        <w:tabs>
+          <w:tab w:val="num" w:pos="720"/>
+        </w:tabs>
+        <w:ind w:left="720" w:hanging="360"/>
+      </w:pPr>
+      <w:rPr>
+        <w:rFonts w:ascii="Symbol" w:hAnsi="Symbol" w:hint="default"/>
+        <w:sz w:val="20"/>
+      </w:rPr>
+    </w:lvl>
+    <w:lvl w:ilvl="1" w:tentative="1">
+      <w:start w:val="1"/>
+      <w:numFmt w:val="bullet"/>
+      <w:lvlText w:val="o"/>
+      <w:lvlJc w:val="left"/>
+      <w:pPr>
+        <w:tabs>
+          <w:tab w:val="num" w:pos="1440"/>
+        </w:tabs>
+        <w:ind w:left="1440" w:hanging="360"/>
+      </w:pPr>
+      <w:rPr>
+        <w:rFonts w:ascii="Courier New" w:hAnsi="Courier New" w:hint="default"/>
+        <w:sz w:val="20"/>
+      </w:rPr>
+    </w:lvl>
+    <w:lvl w:ilvl="2" w:tentative="1">
+      <w:start w:val="1"/>
+      <w:numFmt w:val="bullet"/>
+      <w:lvlText w:val=""/>
+      <w:lvlJc w:val="left"/>
+      <w:pPr>
+        <w:tabs>
+          <w:tab w:val="num" w:pos="2160"/>
+        </w:tabs>
+        <w:ind w:left="2160" w:hanging="360"/>
+      </w:pPr>
+      <w:rPr>
+        <w:rFonts w:ascii="Wingdings" w:hAnsi="Wingdings" w:hint="default"/>
+        <w:sz w:val="20"/>
+      </w:rPr>
+    </w:lvl>
+    <w:lvl w:ilvl="3" w:tentative="1">
+      <w:start w:val="1"/>
+      <w:numFmt w:val="bullet"/>
+      <w:lvlText w:val=""/>
+      <w:lvlJc w:val="left"/>
+      <w:pPr>
+        <w:tabs>
+          <w:tab w:val="num" w:pos="2880"/>
+        </w:tabs>
+        <w:ind w:left="2880" w:hanging="360"/>
+      </w:pPr>
+      <w:rPr>
+        <w:rFonts w:ascii="Wingdings" w:hAnsi="Wingdings" w:hint="default"/>
+        <w:sz w:val="20"/>
+      </w:rPr>
+    </w:lvl>
+    <w:lvl w:ilvl="4" w:tentative="1">
+      <w:start w:val="1"/>
+      <w:numFmt w:val="bullet"/>
+      <w:lvlText w:val=""/>
+      <w:lvlJc w:val="left"/>
+      <w:pPr>
+        <w:tabs>
+          <w:tab w:val="num" w:pos="3600"/>
+        </w:tabs>
+        <w:ind w:left="3600" w:hanging="360"/>
+      </w:pPr>
+      <w:rPr>
+        <w:rFonts w:ascii="Wingdings" w:hAnsi="Wingdings" w:hint="default"/>
+        <w:sz w:val="20"/>
+      </w:rPr>
+    </w:lvl>
+    <w:lvl w:ilvl="5" w:tentative="1">
+      <w:start w:val="1"/>
+      <w:numFmt w:val="bullet"/>
+      <w:lvlText w:val=""/>
+      <w:lvlJc w:val="left"/>
+      <w:pPr>
+        <w:tabs>
+          <w:tab w:val="num" w:pos="4320"/>
+        </w:tabs>
+        <w:ind w:left="4320" w:hanging="360"/>
+      </w:pPr>
+      <w:rPr>
+        <w:rFonts w:ascii="Wingdings" w:hAnsi="Wingdings" w:hint="default"/>
+        <w:sz w:val="20"/>
+      </w:rPr>
+    </w:lvl>
+    <w:lvl w:ilvl="6" w:tentative="1">
+      <w:start w:val="1"/>
+      <w:numFmt w:val="bullet"/>
+      <w:lvlText w:val=""/>
+      <w:lvlJc w:val="left"/>
+      <w:pPr>
+        <w:tabs>
+          <w:tab w:val="num" w:pos="5040"/>
+        </w:tabs>
+        <w:ind w:left="5040" w:hanging="360"/>
+      </w:pPr>
+      <w:rPr>
+        <w:rFonts w:ascii="Wingdings" w:hAnsi="Wingdings" w:hint="default"/>
+        <w:sz w:val="20"/>
+      </w:rPr>
+    </w:lvl>
+    <w:lvl w:ilvl="7" w:tentative="1">
+      <w:start w:val="1"/>
+      <w:numFmt w:val="bullet"/>
+      <w:lvlText w:val=""/>
+      <w:lvlJc w:val="left"/>
+      <w:pPr>
+        <w:tabs>
+          <w:tab w:val="num" w:pos="5760"/>
+        </w:tabs>
+        <w:ind w:left="5760" w:hanging="360"/>
+      </w:pPr>
+      <w:rPr>
+        <w:rFonts w:ascii="Wingdings" w:hAnsi="Wingdings" w:hint="default"/>
+        <w:sz w:val="20"/>
+      </w:rPr>
+    </w:lvl>
+    <w:lvl w:ilvl="8" w:tentative="1">
+      <w:start w:val="1"/>
+      <w:numFmt w:val="bullet"/>
+      <w:lvlText w:val=""/>
+      <w:lvlJc w:val="left"/>
+      <w:pPr>
+        <w:tabs>
+          <w:tab w:val="num" w:pos="6480"/>
+        </w:tabs>
+        <w:ind w:left="6480" w:hanging="360"/>
+      </w:pPr>
+      <w:rPr>
+        <w:rFonts w:ascii="Wingdings" w:hAnsi="Wingdings" w:hint="default"/>
+        <w:sz w:val="20"/>
+      </w:rPr>
+    </w:lvl>
+  </w:abstractNum>
   <w:num w:numId="1" w16cid:durableId="853224157">
     <w:abstractNumId w:val="6"/>
   </w:num>
   <w:num w:numId="2" w16cid:durableId="787546523">
-    <w:abstractNumId w:val="16"/>
+    <w:abstractNumId w:val="17"/>
   </w:num>
   <w:num w:numId="3" w16cid:durableId="1361933628">
-    <w:abstractNumId w:val="10"/>
+    <w:abstractNumId w:val="11"/>
   </w:num>
   <w:num w:numId="4" w16cid:durableId="734086421">
-    <w:abstractNumId w:val="11"/>
+    <w:abstractNumId w:val="12"/>
   </w:num>
   <w:num w:numId="5" w16cid:durableId="125584642">
     <w:abstractNumId w:val="0"/>
   </w:num>
   <w:num w:numId="6" w16cid:durableId="1674408133">
-    <w:abstractNumId w:val="9"/>
+    <w:abstractNumId w:val="10"/>
   </w:num>
   <w:num w:numId="7" w16cid:durableId="832065036">
     <w:abstractNumId w:val="7"/>
   </w:num>
   <w:num w:numId="8" w16cid:durableId="617758205">
-    <w:abstractNumId w:val="14"/>
+    <w:abstractNumId w:val="15"/>
   </w:num>
   <w:num w:numId="9" w16cid:durableId="2090225711">
     <w:abstractNumId w:val="2"/>
@@ -28032,31 +30496,34 @@
     <w:abstractNumId w:val="5"/>
   </w:num>
   <w:num w:numId="11" w16cid:durableId="964233505">
-    <w:abstractNumId w:val="13"/>
+    <w:abstractNumId w:val="14"/>
   </w:num>
   <w:num w:numId="12" w16cid:durableId="317467616">
-    <w:abstractNumId w:val="8"/>
+    <w:abstractNumId w:val="9"/>
   </w:num>
   <w:num w:numId="13" w16cid:durableId="1150050161">
-    <w:abstractNumId w:val="18"/>
+    <w:abstractNumId w:val="19"/>
   </w:num>
   <w:num w:numId="14" w16cid:durableId="382944577">
-    <w:abstractNumId w:val="12"/>
+    <w:abstractNumId w:val="13"/>
   </w:num>
   <w:num w:numId="15" w16cid:durableId="27067304">
     <w:abstractNumId w:val="3"/>
   </w:num>
   <w:num w:numId="16" w16cid:durableId="2077588120">
-    <w:abstractNumId w:val="17"/>
+    <w:abstractNumId w:val="18"/>
   </w:num>
   <w:num w:numId="17" w16cid:durableId="599484996">
-    <w:abstractNumId w:val="15"/>
+    <w:abstractNumId w:val="16"/>
   </w:num>
   <w:num w:numId="18" w16cid:durableId="338311912">
     <w:abstractNumId w:val="1"/>
   </w:num>
   <w:num w:numId="19" w16cid:durableId="1294411647">
     <w:abstractNumId w:val="4"/>
+  </w:num>
+  <w:num w:numId="20" w16cid:durableId="1572813508">
+    <w:abstractNumId w:val="8"/>
   </w:num>
 </w:numbering>
 </file>

</xml_diff>